<commit_message>
Add Milestone 2 real-data train path. Wire Beijing air-quality windows through normalize, DSM training, and val imputation with frozen EVAL/assumptions.
</commit_message>
<xml_diff>
--- a/docs/דוח התקדמות.docx
+++ b/docs/דוח התקדמות.docx
@@ -2,6 +2,27 @@
 <file path=word/document.xml><?xml version="1.0" encoding="utf-8"?>
 <w:document xmlns:wpc="http://schemas.microsoft.com/office/word/2010/wordprocessingCanvas" xmlns:cx="http://schemas.microsoft.com/office/drawing/2014/chartex" xmlns:cx1="http://schemas.microsoft.com/office/drawing/2015/9/8/chartex" xmlns:cx2="http://schemas.microsoft.com/office/drawing/2015/10/21/chartex" xmlns:cx3="http://schemas.microsoft.com/office/drawing/2016/5/9/chartex" xmlns:cx4="http://schemas.microsoft.com/office/drawing/2016/5/10/chartex" xmlns:cx5="http://schemas.microsoft.com/office/drawing/2016/5/11/chartex" xmlns:cx6="http://schemas.microsoft.com/office/drawing/2016/5/12/chartex" xmlns:cx7="http://schemas.microsoft.com/office/drawing/2016/5/13/chartex" xmlns:cx8="http://schemas.microsoft.com/office/drawing/2016/5/14/chartex" xmlns:mc="http://schemas.openxmlformats.org/markup-compatibility/2006" xmlns:aink="http://schemas.microsoft.com/office/drawing/2016/ink" xmlns:am3d="http://schemas.microsoft.com/office/drawing/2017/model3d" xmlns:o="urn:schemas-microsoft-com:office:office" xmlns:oel="http://schemas.microsoft.com/office/2019/extlst" xmlns:r="http://schemas.openxmlformats.org/officeDocument/2006/relationships" xmlns:m="http://schemas.openxmlformats.org/officeDocument/2006/math" xmlns:v="urn:schemas-microsoft-com:vml" xmlns:wp14="http://schemas.microsoft.com/office/word/2010/wordprocessingDrawing" xmlns:wp="http://schemas.openxmlformats.org/drawingml/2006/wordprocessingDrawing" xmlns:w10="urn:schemas-microsoft-com:office:word" xmlns:w="http://schemas.openxmlformats.org/wordprocessingml/2006/main" xmlns:w14="http://schemas.microsoft.com/office/word/2010/wordml" xmlns:w15="http://schemas.microsoft.com/office/word/2012/wordml" xmlns:w16cex="http://schemas.microsoft.com/office/word/2018/wordml/cex" xmlns:w16cid="http://schemas.microsoft.com/office/word/2016/wordml/cid" xmlns:w16="http://schemas.microsoft.com/office/word/2018/wordml" xmlns:w16du="http://schemas.microsoft.com/office/word/2023/wordml/word16du" xmlns:w16sdtdh="http://schemas.microsoft.com/office/word/2020/wordml/sdtdatahash" xmlns:w16sdtfl="http://schemas.microsoft.com/office/word/2024/wordml/sdtformatlock" xmlns:w16se="http://schemas.microsoft.com/office/word/2015/wordml/symex" xmlns:wpg="http://schemas.microsoft.com/office/word/2010/wordprocessingGroup" xmlns:wpi="http://schemas.microsoft.com/office/word/2010/wordprocessingInk" xmlns:wne="http://schemas.microsoft.com/office/word/2006/wordml" xmlns:wps="http://schemas.microsoft.com/office/word/2010/wordprocessingShape" mc:Ignorable="w14 w15 w16se w16cid w16 w16cex w16sdtdh w16sdtfl w16du wp14">
   <w:body>
+    <w:p>
+      <w:pPr>
+        <w:jc w:val="center"/>
+        <w:rPr>
+          <w:rFonts w:hint="cs"/>
+          <w:sz w:val="36"/>
+          <w:szCs w:val="36"/>
+          <w:rtl/>
+        </w:rPr>
+      </w:pPr>
+      <w:r>
+        <w:rPr>
+          <w:b/>
+          <w:bCs/>
+          <w:sz w:val="36"/>
+          <w:szCs w:val="36"/>
+          <w:u w:val="single"/>
+        </w:rPr>
+        <w:t>TimeFill</w:t>
+      </w:r>
+    </w:p>
     <w:p>
       <w:pPr>
         <w:rPr>
@@ -280,14 +301,7 @@
           <w:rFonts w:hint="cs"/>
           <w:rtl/>
         </w:rPr>
-        <w:t>(ברירת המחדל היא 64).</w:t>
-      </w:r>
-      <w:r>
-        <w:rPr>
-          <w:rFonts w:hint="cs"/>
-          <w:rtl/>
-        </w:rPr>
-        <w:t xml:space="preserve"> בפרויקט שלנו, </w:t>
+        <w:t xml:space="preserve">(ברירת המחדל היא 64). בפרויקט שלנו, </w:t>
       </w:r>
       <m:oMath>
         <m:r>
@@ -941,6 +955,7 @@
           <w:bCs/>
           <w:rtl/>
         </w:rPr>
+        <w:lastRenderedPageBreak/>
         <w:t>מסקינג</w:t>
       </w:r>
       <w:r>
@@ -977,7 +992,6 @@
           <w:rFonts w:hint="cs"/>
           <w:rtl/>
         </w:rPr>
-        <w:lastRenderedPageBreak/>
         <w:t xml:space="preserve">עבור כל איבר </w:t>
       </w:r>
       <m:oMath>
@@ -2174,22 +2188,6 @@
     <w:p>
       <w:pPr>
         <w:rPr>
-          <w:i/>
-          <w:rtl/>
-        </w:rPr>
-      </w:pPr>
-    </w:p>
-    <w:p>
-      <w:pPr>
-        <w:rPr>
-          <w:i/>
-          <w:rtl/>
-        </w:rPr>
-      </w:pPr>
-    </w:p>
-    <w:p>
-      <w:pPr>
-        <w:rPr>
           <w:b/>
           <w:bCs/>
           <w:sz w:val="36"/>
@@ -2248,7 +2246,6 @@
     <w:p>
       <w:pPr>
         <w:rPr>
-          <w:rFonts w:hint="cs"/>
           <w:i/>
           <w:iCs/>
         </w:rPr>
@@ -2331,12 +2328,12 @@
     <w:p>
       <w:pPr>
         <w:rPr>
-          <w:rFonts w:hint="cs"/>
-          <w:rtl/>
-        </w:rPr>
-      </w:pPr>
-      <w:r>
-        <w:rPr>
+          <w:rtl/>
+        </w:rPr>
+      </w:pPr>
+      <w:r>
+        <w:rPr>
+          <w:noProof/>
           <w:rtl/>
         </w:rPr>
         <w:drawing>
@@ -2598,7 +2595,6 @@
           <w:tab w:val="left" w:pos="2107"/>
         </w:tabs>
         <w:rPr>
-          <w:rFonts w:hint="cs"/>
           <w:i/>
           <w:rtl/>
         </w:rPr>
@@ -2655,12 +2651,12 @@
     <w:p>
       <w:pPr>
         <w:rPr>
-          <w:rFonts w:hint="cs"/>
-          <w:rtl/>
-        </w:rPr>
-      </w:pPr>
-      <w:r>
-        <w:rPr>
+          <w:rtl/>
+        </w:rPr>
+      </w:pPr>
+      <w:r>
+        <w:rPr>
+          <w:noProof/>
           <w:rtl/>
         </w:rPr>
         <w:drawing>
@@ -3071,11 +3067,6 @@
       </w:r>
     </w:p>
     <w:p>
-      <w:pPr>
-        <w:rPr>
-          <w:rFonts w:hint="cs"/>
-        </w:rPr>
-      </w:pPr>
       <w:r>
         <w:rPr>
           <w:rFonts w:hint="cs"/>
@@ -4339,6 +4330,7 @@
       <w:r>
         <w:rPr>
           <w:i/>
+          <w:noProof/>
         </w:rPr>
         <w:lastRenderedPageBreak/>
         <w:drawing>
@@ -4669,14 +4661,14 @@
     <w:p>
       <w:pPr>
         <w:rPr>
-          <w:rFonts w:hint="cs"/>
-          <w:i/>
-          <w:rtl/>
-        </w:rPr>
-      </w:pPr>
-      <w:r>
-        <w:rPr>
-          <w:i/>
+          <w:i/>
+          <w:rtl/>
+        </w:rPr>
+      </w:pPr>
+      <w:r>
+        <w:rPr>
+          <w:i/>
+          <w:noProof/>
           <w:rtl/>
         </w:rPr>
         <w:lastRenderedPageBreak/>
@@ -4752,6 +4744,7 @@
       </w:pPr>
       <w:r>
         <w:rPr>
+          <w:noProof/>
           <w:rtl/>
         </w:rPr>
         <w:drawing>
@@ -6008,7 +6001,6 @@
     <w:p>
       <w:pPr>
         <w:rPr>
-          <w:rFonts w:hint="cs"/>
           <w:i/>
           <w:rtl/>
         </w:rPr>
@@ -6039,7 +6031,6 @@
     <w:p>
       <w:pPr>
         <w:rPr>
-          <w:rFonts w:hint="cs"/>
           <w:i/>
           <w:rtl/>
         </w:rPr>
@@ -6853,6 +6844,7 @@
       <w:r>
         <w:rPr>
           <w:i/>
+          <w:noProof/>
         </w:rPr>
         <w:drawing>
           <wp:anchor distT="0" distB="0" distL="114300" distR="114300" simplePos="0" relativeHeight="251658240" behindDoc="1" locked="0" layoutInCell="1" allowOverlap="1" wp14:anchorId="5AE21394" wp14:editId="2ABE105D">
@@ -7422,7 +7414,6 @@
     <w:p>
       <w:pPr>
         <w:rPr>
-          <w:rFonts w:hint="cs"/>
           <w:i/>
           <w:rtl/>
         </w:rPr>
@@ -7601,13 +7592,7 @@
                     <w:rPr>
                       <w:rFonts w:ascii="Cambria Math" w:hAnsi="Cambria Math"/>
                     </w:rPr>
-                    <m:t>k</m:t>
-                  </m:r>
-                  <m:r>
-                    <w:rPr>
-                      <w:rFonts w:ascii="Cambria Math" w:hAnsi="Cambria Math"/>
-                    </w:rPr>
-                    <m:t>-1</m:t>
+                    <m:t>k-1</m:t>
                   </m:r>
                 </m:sup>
                 <m:e>
@@ -8264,25 +8249,7 @@
               <w:rPr>
                 <w:rFonts w:ascii="Cambria Math" w:hAnsi="Cambria Math"/>
               </w:rPr>
-              <m:t>index</m:t>
-            </m:r>
-            <m:r>
-              <m:rPr>
-                <m:nor/>
-              </m:rPr>
-              <w:rPr>
-                <w:rFonts w:ascii="Cambria Math" w:hAnsi="Cambria Math"/>
-              </w:rPr>
-              <m:t>-</m:t>
-            </m:r>
-            <m:r>
-              <m:rPr>
-                <m:nor/>
-              </m:rPr>
-              <w:rPr>
-                <w:rFonts w:ascii="Cambria Math" w:hAnsi="Cambria Math"/>
-              </w:rPr>
-              <m:t>encoding</m:t>
+              <m:t>index-encoding</m:t>
             </m:r>
             <m:d>
               <m:dPr>
@@ -10211,6 +10178,7 @@
       <w:r>
         <w:rPr>
           <w:i/>
+          <w:noProof/>
           <w:rtl/>
         </w:rPr>
         <w:drawing>
@@ -11684,8 +11652,7 @@
     <w:p>
       <w:pPr>
         <w:rPr>
-          <w:rFonts w:hint="cs"/>
-          <w:iCs/>
+          <w:i/>
           <w:rtl/>
         </w:rPr>
       </w:pPr>
@@ -11844,6 +11811,4019 @@
           <w:iCs/>
         </w:rPr>
         <w:t>noise schedule</w:t>
+      </w:r>
+      <w:r>
+        <w:rPr>
+          <w:rFonts w:hint="cs"/>
+          <w:iCs/>
+          <w:rtl/>
+        </w:rPr>
+        <w:t>.</w:t>
+      </w:r>
+      <w:r>
+        <w:rPr>
+          <w:rFonts w:hint="cs"/>
+          <w:i/>
+          <w:rtl/>
+        </w:rPr>
+        <w:t xml:space="preserve"> בהמשך, התהליך האחורי של </w:t>
+      </w:r>
+      <w:r>
+        <w:rPr>
+          <w:iCs/>
+        </w:rPr>
+        <w:t>WP5</w:t>
+      </w:r>
+      <w:r>
+        <w:rPr>
+          <w:rFonts w:hint="cs"/>
+          <w:i/>
+          <w:rtl/>
+        </w:rPr>
+        <w:t xml:space="preserve"> משתמש בניקוד זה בכל </w:t>
+      </w:r>
+      <m:oMath>
+        <m:r>
+          <w:rPr>
+            <w:rFonts w:ascii="Cambria Math" w:hAnsi="Cambria Math"/>
+          </w:rPr>
+          <m:t>t</m:t>
+        </m:r>
+      </m:oMath>
+      <w:r>
+        <w:rPr>
+          <w:rFonts w:hint="cs"/>
+          <w:i/>
+          <w:rtl/>
+        </w:rPr>
+        <w:t xml:space="preserve"> לאורך המסלול מרעש בחזרה לנתונים.</w:t>
+      </w:r>
+    </w:p>
+    <w:p>
+      <w:pPr>
+        <w:rPr>
+          <w:i/>
+          <w:rtl/>
+        </w:rPr>
+      </w:pPr>
+      <w:r>
+        <w:rPr>
+          <w:b/>
+          <w:bCs/>
+          <w:iCs/>
+          <w:u w:val="single"/>
+        </w:rPr>
+        <w:t>WP5</w:t>
+      </w:r>
+      <w:r>
+        <w:rPr>
+          <w:rFonts w:hint="cs"/>
+          <w:b/>
+          <w:bCs/>
+          <w:iCs/>
+          <w:rtl/>
+        </w:rPr>
+        <w:t xml:space="preserve"> </w:t>
+      </w:r>
+      <w:r>
+        <w:rPr>
+          <w:rFonts w:hint="cs"/>
+          <w:i/>
+          <w:rtl/>
+        </w:rPr>
+        <w:t>- בחבילה זו, אנחנו מיישמים את פאזה 3, שזוהי אימפוטציה עבור מד"ס אחורית. אנו הופכים מודל ניקוד מאומן למילויים הסתברותיים של תאים ריקים.</w:t>
+      </w:r>
+    </w:p>
+    <w:p>
+      <w:pPr>
+        <w:rPr>
+          <w:rtl/>
+        </w:rPr>
+      </w:pPr>
+    </w:p>
+    <w:p>
+      <w:pPr>
+        <w:rPr>
+          <w:rtl/>
+        </w:rPr>
+      </w:pPr>
+    </w:p>
+    <w:p>
+      <w:pPr>
+        <w:rPr>
+          <w:rtl/>
+        </w:rPr>
+      </w:pPr>
+    </w:p>
+    <w:p>
+      <w:pPr>
+        <w:rPr>
+          <w:rtl/>
+        </w:rPr>
+      </w:pPr>
+    </w:p>
+    <w:p>
+      <w:pPr>
+        <w:rPr>
+          <w:rtl/>
+        </w:rPr>
+      </w:pPr>
+      <w:r>
+        <w:rPr>
+          <w:noProof/>
+          <w:rtl/>
+        </w:rPr>
+        <w:lastRenderedPageBreak/>
+        <w:drawing>
+          <wp:inline distT="0" distB="0" distL="0" distR="0" wp14:anchorId="43AECF55" wp14:editId="667CB0E9">
+            <wp:extent cx="5731510" cy="4287520"/>
+            <wp:effectExtent l="0" t="0" r="2540" b="0"/>
+            <wp:docPr id="83750980" name="Picture 1"/>
+            <wp:cNvGraphicFramePr>
+              <a:graphicFrameLocks xmlns:a="http://schemas.openxmlformats.org/drawingml/2006/main" noChangeAspect="1"/>
+            </wp:cNvGraphicFramePr>
+            <a:graphic xmlns:a="http://schemas.openxmlformats.org/drawingml/2006/main">
+              <a:graphicData uri="http://schemas.openxmlformats.org/drawingml/2006/picture">
+                <pic:pic xmlns:pic="http://schemas.openxmlformats.org/drawingml/2006/picture">
+                  <pic:nvPicPr>
+                    <pic:cNvPr id="83750980" name=""/>
+                    <pic:cNvPicPr/>
+                  </pic:nvPicPr>
+                  <pic:blipFill>
+                    <a:blip r:embed="rId14"/>
+                    <a:stretch>
+                      <a:fillRect/>
+                    </a:stretch>
+                  </pic:blipFill>
+                  <pic:spPr>
+                    <a:xfrm>
+                      <a:off x="0" y="0"/>
+                      <a:ext cx="5731510" cy="4287520"/>
+                    </a:xfrm>
+                    <a:prstGeom prst="rect">
+                      <a:avLst/>
+                    </a:prstGeom>
+                  </pic:spPr>
+                </pic:pic>
+              </a:graphicData>
+            </a:graphic>
+          </wp:inline>
+        </w:drawing>
+      </w:r>
+    </w:p>
+    <w:p>
+      <w:pPr>
+        <w:rPr>
+          <w:i/>
+          <w:rtl/>
+        </w:rPr>
+      </w:pPr>
+      <w:r>
+        <w:rPr>
+          <w:rFonts w:hint="cs"/>
+          <w:rtl/>
+        </w:rPr>
+        <w:t xml:space="preserve">אנו מתחילים מרעש ב </w:t>
+      </w:r>
+      <m:oMath>
+        <m:r>
+          <w:rPr>
+            <w:rFonts w:ascii="Cambria Math" w:hAnsi="Cambria Math"/>
+          </w:rPr>
+          <m:t>t=</m:t>
+        </m:r>
+        <m:sSub>
+          <m:sSubPr>
+            <m:ctrlPr>
+              <w:rPr>
+                <w:rFonts w:ascii="Cambria Math" w:hAnsi="Cambria Math"/>
+                <w:i/>
+              </w:rPr>
+            </m:ctrlPr>
+          </m:sSubPr>
+          <m:e>
+            <m:r>
+              <w:rPr>
+                <w:rFonts w:ascii="Cambria Math" w:hAnsi="Cambria Math"/>
+              </w:rPr>
+              <m:t>T</m:t>
+            </m:r>
+          </m:e>
+          <m:sub>
+            <m:r>
+              <m:rPr>
+                <m:nor/>
+              </m:rPr>
+              <w:rPr>
+                <w:rFonts w:ascii="Cambria Math" w:hAnsi="Cambria Math"/>
+              </w:rPr>
+              <m:t>diff</m:t>
+            </m:r>
+          </m:sub>
+        </m:sSub>
+      </m:oMath>
+      <w:r>
+        <w:rPr>
+          <w:rFonts w:hint="cs"/>
+          <w:rtl/>
+        </w:rPr>
+        <w:t xml:space="preserve">, מבצעים אינטגרציה על מד"ס אחורית אנדרסון, עם אוילר-מרויאמה, שומרים את הקווארדינטות הנצפות באמצעות מסקינג, מציירים </w:t>
+      </w:r>
+      <m:oMath>
+        <m:r>
+          <w:rPr>
+            <w:rFonts w:ascii="Cambria Math" w:hAnsi="Cambria Math"/>
+          </w:rPr>
+          <m:t>K</m:t>
+        </m:r>
+      </m:oMath>
+      <w:r>
+        <w:rPr>
+          <w:rFonts w:hint="cs"/>
+          <w:rtl/>
+        </w:rPr>
+        <w:t xml:space="preserve"> מסלולים, ואז מדווחים תועלת ורצועות </w:t>
+      </w:r>
+      <w:r>
+        <w:rPr>
+          <w:rFonts w:hint="cs"/>
+          <w:i/>
+          <w:rtl/>
+        </w:rPr>
+        <w:t>10%/90%.</w:t>
+      </w:r>
+    </w:p>
+    <w:p>
+      <w:pPr>
+        <w:rPr>
+          <w:i/>
+          <w:rtl/>
+        </w:rPr>
+      </w:pPr>
+      <w:r>
+        <w:rPr>
+          <w:iCs/>
+        </w:rPr>
+        <w:t>WP0-WP4</w:t>
+      </w:r>
+      <w:r>
+        <w:rPr>
+          <w:rFonts w:hint="cs"/>
+          <w:iCs/>
+          <w:rtl/>
+        </w:rPr>
+        <w:t xml:space="preserve"> </w:t>
+      </w:r>
+      <w:r>
+        <w:rPr>
+          <w:rFonts w:hint="cs"/>
+          <w:i/>
+          <w:rtl/>
+        </w:rPr>
+        <w:t xml:space="preserve">רק נותנים </w:t>
+      </w:r>
+      <w:r>
+        <w:rPr>
+          <w:iCs/>
+        </w:rPr>
+        <w:t>noising</w:t>
+      </w:r>
+      <w:r>
+        <w:rPr>
+          <w:rFonts w:hint="cs"/>
+          <w:i/>
+          <w:rtl/>
+        </w:rPr>
+        <w:t xml:space="preserve"> קדמי + רשת ניקוד + אימון. זה עדיין לא מייצר אימפוטציות.</w:t>
+      </w:r>
+    </w:p>
+    <w:p>
+      <w:pPr>
+        <w:rPr>
+          <w:i/>
+          <w:rtl/>
+        </w:rPr>
+      </w:pPr>
+      <w:r>
+        <w:rPr>
+          <w:iCs/>
+        </w:rPr>
+        <w:t>WP5</w:t>
+      </w:r>
+      <w:r>
+        <w:rPr>
+          <w:rFonts w:hint="cs"/>
+          <w:i/>
+          <w:rtl/>
+        </w:rPr>
+        <w:t xml:space="preserve"> הוא </w:t>
+      </w:r>
+      <w:r>
+        <w:rPr>
+          <w:rFonts w:hint="cs"/>
+          <w:b/>
+          <w:bCs/>
+          <w:i/>
+          <w:rtl/>
+        </w:rPr>
+        <w:t>טענת המוצר</w:t>
+      </w:r>
+      <w:r>
+        <w:rPr>
+          <w:rFonts w:hint="cs"/>
+          <w:i/>
+          <w:rtl/>
+        </w:rPr>
+        <w:t xml:space="preserve"> של </w:t>
+      </w:r>
+      <w:r>
+        <w:rPr>
+          <w:iCs/>
+        </w:rPr>
+        <w:t>M1</w:t>
+      </w:r>
+      <w:r>
+        <w:rPr>
+          <w:rFonts w:hint="cs"/>
+          <w:i/>
+          <w:rtl/>
+        </w:rPr>
+        <w:t>:</w:t>
+      </w:r>
+    </w:p>
+    <w:p>
+      <w:pPr>
+        <w:rPr>
+          <w:i/>
+          <w:rtl/>
+        </w:rPr>
+      </w:pPr>
+      <w:r>
+        <w:rPr>
+          <w:rFonts w:hint="cs"/>
+          <w:i/>
+          <w:rtl/>
+        </w:rPr>
+        <w:t xml:space="preserve">1. סוגר את הלולאה </w:t>
+      </w:r>
+      <w:r>
+        <w:rPr>
+          <w:i/>
+          <w:rtl/>
+        </w:rPr>
+        <w:t>–</w:t>
+      </w:r>
+      <w:r>
+        <w:rPr>
+          <w:rFonts w:hint="cs"/>
+          <w:i/>
+          <w:rtl/>
+        </w:rPr>
+        <w:t xml:space="preserve"> תצפיות ומאסק הופכות למדגמים פוסטריורים.</w:t>
+      </w:r>
+    </w:p>
+    <w:p>
+      <w:pPr>
+        <w:rPr>
+          <w:i/>
+          <w:rtl/>
+        </w:rPr>
+      </w:pPr>
+      <w:r>
+        <w:rPr>
+          <w:rFonts w:hint="cs"/>
+          <w:i/>
+          <w:rtl/>
+        </w:rPr>
+        <w:t xml:space="preserve">2. אי-ודאות, לא מילוי יחיד </w:t>
+      </w:r>
+      <w:r>
+        <w:rPr>
+          <w:i/>
+          <w:rtl/>
+        </w:rPr>
+        <w:t>–</w:t>
+      </w:r>
+      <w:r>
+        <w:rPr>
+          <w:rFonts w:hint="cs"/>
+          <w:i/>
+          <w:rtl/>
+        </w:rPr>
+        <w:t xml:space="preserve"> </w:t>
+      </w:r>
+      <w:r>
+        <w:rPr>
+          <w:i/>
+        </w:rPr>
+        <w:t>K</w:t>
+      </w:r>
+      <w:r>
+        <w:rPr>
+          <w:rFonts w:hint="cs"/>
+          <w:i/>
+          <w:rtl/>
+        </w:rPr>
+        <w:t xml:space="preserve"> מסלולים שהופכים לתוחלת ורצועות שברונים (בניגוד ל </w:t>
+      </w:r>
+      <w:r>
+        <w:rPr>
+          <w:iCs/>
+        </w:rPr>
+        <w:t>LOCF/linear</w:t>
+      </w:r>
+      <w:r>
+        <w:rPr>
+          <w:rFonts w:hint="cs"/>
+          <w:i/>
+          <w:rtl/>
+        </w:rPr>
+        <w:t>).</w:t>
+      </w:r>
+    </w:p>
+    <w:p>
+      <w:pPr>
+        <w:rPr>
+          <w:i/>
+          <w:rtl/>
+        </w:rPr>
+      </w:pPr>
+      <w:r>
+        <w:rPr>
+          <w:rFonts w:hint="cs"/>
+          <w:i/>
+          <w:rtl/>
+        </w:rPr>
+        <w:t xml:space="preserve">3. שימוש בנומריקות זמן רציף </w:t>
+      </w:r>
+      <w:r>
+        <w:rPr>
+          <w:i/>
+          <w:rtl/>
+        </w:rPr>
+        <w:t>–</w:t>
+      </w:r>
+      <w:r>
+        <w:rPr>
+          <w:rFonts w:hint="cs"/>
+          <w:i/>
+          <w:rtl/>
+        </w:rPr>
+        <w:t xml:space="preserve"> פתרון מד"ס באמצעות </w:t>
+      </w:r>
+      <w:r>
+        <w:rPr>
+          <w:iCs/>
+        </w:rPr>
+        <w:t>Diffrax</w:t>
+      </w:r>
+      <w:r>
+        <w:rPr>
+          <w:rFonts w:hint="cs"/>
+          <w:i/>
+          <w:rtl/>
+        </w:rPr>
+        <w:t>.</w:t>
+      </w:r>
+    </w:p>
+    <w:p>
+      <w:pPr>
+        <w:rPr>
+          <w:i/>
+          <w:rtl/>
+        </w:rPr>
+      </w:pPr>
+      <w:r>
+        <w:rPr>
+          <w:rFonts w:hint="cs"/>
+          <w:i/>
+          <w:rtl/>
+        </w:rPr>
+        <w:t xml:space="preserve">4. הפיכת ההתניה לאמיתית </w:t>
+      </w:r>
+      <w:r>
+        <w:rPr>
+          <w:i/>
+          <w:rtl/>
+        </w:rPr>
+        <w:t>–</w:t>
+      </w:r>
+      <w:r>
+        <w:rPr>
+          <w:rFonts w:hint="cs"/>
+          <w:i/>
+          <w:rtl/>
+        </w:rPr>
+        <w:t xml:space="preserve"> ניקוד רואה (</w:t>
+      </w:r>
+      <w:r>
+        <w:rPr>
+          <w:iCs/>
+        </w:rPr>
+        <w:t>mask, x_obs</w:t>
+      </w:r>
+      <w:r>
+        <w:rPr>
+          <w:rFonts w:hint="cs"/>
+          <w:i/>
+          <w:rtl/>
+        </w:rPr>
+        <w:t xml:space="preserve">); תאים נצפים הם מוקפאים או מתחלפים כך שהם לא </w:t>
+      </w:r>
+      <w:r>
+        <w:rPr>
+          <w:iCs/>
+        </w:rPr>
+        <w:t>overwritten</w:t>
+      </w:r>
+      <w:r>
+        <w:rPr>
+          <w:rFonts w:hint="cs"/>
+          <w:i/>
+          <w:rtl/>
+        </w:rPr>
+        <w:t>.</w:t>
+      </w:r>
+    </w:p>
+    <w:p>
+      <w:pPr>
+        <w:rPr>
+          <w:i/>
+          <w:rtl/>
+        </w:rPr>
+      </w:pPr>
+      <w:r>
+        <w:rPr>
+          <w:rFonts w:hint="cs"/>
+          <w:i/>
+          <w:rtl/>
+        </w:rPr>
+        <w:t xml:space="preserve">מבחינה מתמטית, </w:t>
+      </w:r>
+      <w:r>
+        <w:rPr>
+          <w:iCs/>
+        </w:rPr>
+        <w:t>WP2-WP4</w:t>
+      </w:r>
+      <w:r>
+        <w:rPr>
+          <w:rFonts w:hint="cs"/>
+          <w:i/>
+          <w:rtl/>
+        </w:rPr>
+        <w:t xml:space="preserve"> לומדים קירוב של ה</w:t>
+      </w:r>
+      <w:r>
+        <w:rPr>
+          <w:rFonts w:hint="cs"/>
+          <w:b/>
+          <w:bCs/>
+          <w:i/>
+          <w:rtl/>
+        </w:rPr>
+        <w:t>ניקוד</w:t>
+      </w:r>
+      <w:r>
+        <w:rPr>
+          <w:rFonts w:hint="cs"/>
+          <w:i/>
+          <w:rtl/>
+        </w:rPr>
+        <w:t xml:space="preserve"> של המרגינלים הרועשים של ה </w:t>
+      </w:r>
+      <w:r>
+        <w:rPr>
+          <w:iCs/>
+        </w:rPr>
+        <w:t>VP-SDE</w:t>
+      </w:r>
+      <w:r>
+        <w:rPr>
+          <w:rFonts w:hint="cs"/>
+          <w:i/>
+          <w:rtl/>
+        </w:rPr>
+        <w:t xml:space="preserve"> הקדמי:</w:t>
+      </w:r>
+    </w:p>
+    <w:p>
+      <w:pPr>
+        <w:rPr>
+          <w:i/>
+          <w:rtl/>
+        </w:rPr>
+      </w:pPr>
+      <m:oMathPara>
+        <m:oMath>
+          <m:r>
+            <w:rPr>
+              <w:rFonts w:ascii="Cambria Math" w:hAnsi="Cambria Math"/>
+            </w:rPr>
+            <w:lastRenderedPageBreak/>
+            <m:t>dx=-</m:t>
+          </m:r>
+          <m:f>
+            <m:fPr>
+              <m:ctrlPr>
+                <w:rPr>
+                  <w:rFonts w:ascii="Cambria Math" w:hAnsi="Cambria Math"/>
+                  <w:i/>
+                </w:rPr>
+              </m:ctrlPr>
+            </m:fPr>
+            <m:num>
+              <m:r>
+                <w:rPr>
+                  <w:rFonts w:ascii="Cambria Math" w:hAnsi="Cambria Math"/>
+                </w:rPr>
+                <m:t>1</m:t>
+              </m:r>
+            </m:num>
+            <m:den>
+              <m:r>
+                <w:rPr>
+                  <w:rFonts w:ascii="Cambria Math" w:hAnsi="Cambria Math"/>
+                </w:rPr>
+                <m:t>2</m:t>
+              </m:r>
+            </m:den>
+          </m:f>
+          <m:r>
+            <w:rPr>
+              <w:rFonts w:ascii="Cambria Math" w:hAnsi="Cambria Math"/>
+            </w:rPr>
+            <m:t>β</m:t>
+          </m:r>
+          <m:d>
+            <m:dPr>
+              <m:ctrlPr>
+                <w:rPr>
+                  <w:rFonts w:ascii="Cambria Math" w:hAnsi="Cambria Math"/>
+                  <w:i/>
+                </w:rPr>
+              </m:ctrlPr>
+            </m:dPr>
+            <m:e>
+              <m:r>
+                <w:rPr>
+                  <w:rFonts w:ascii="Cambria Math" w:hAnsi="Cambria Math"/>
+                </w:rPr>
+                <m:t>t</m:t>
+              </m:r>
+            </m:e>
+          </m:d>
+          <m:r>
+            <w:rPr>
+              <w:rFonts w:ascii="Cambria Math" w:hAnsi="Cambria Math"/>
+            </w:rPr>
+            <m:t>xdt+</m:t>
+          </m:r>
+          <m:rad>
+            <m:radPr>
+              <m:degHide m:val="1"/>
+              <m:ctrlPr>
+                <w:rPr>
+                  <w:rFonts w:ascii="Cambria Math" w:hAnsi="Cambria Math"/>
+                  <w:i/>
+                </w:rPr>
+              </m:ctrlPr>
+            </m:radPr>
+            <m:deg/>
+            <m:e>
+              <m:r>
+                <w:rPr>
+                  <w:rFonts w:ascii="Cambria Math" w:hAnsi="Cambria Math"/>
+                </w:rPr>
+                <m:t>β</m:t>
+              </m:r>
+              <m:d>
+                <m:dPr>
+                  <m:ctrlPr>
+                    <w:rPr>
+                      <w:rFonts w:ascii="Cambria Math" w:hAnsi="Cambria Math"/>
+                      <w:i/>
+                    </w:rPr>
+                  </m:ctrlPr>
+                </m:dPr>
+                <m:e>
+                  <m:r>
+                    <w:rPr>
+                      <w:rFonts w:ascii="Cambria Math" w:hAnsi="Cambria Math"/>
+                    </w:rPr>
+                    <m:t>t</m:t>
+                  </m:r>
+                </m:e>
+              </m:d>
+            </m:e>
+          </m:rad>
+          <m:r>
+            <w:rPr>
+              <w:rFonts w:ascii="Cambria Math" w:hAnsi="Cambria Math"/>
+            </w:rPr>
+            <m:t xml:space="preserve">dW,  </m:t>
+          </m:r>
+          <m:sSub>
+            <m:sSubPr>
+              <m:ctrlPr>
+                <w:rPr>
+                  <w:rFonts w:ascii="Cambria Math" w:hAnsi="Cambria Math"/>
+                  <w:i/>
+                </w:rPr>
+              </m:ctrlPr>
+            </m:sSubPr>
+            <m:e>
+              <m:r>
+                <w:rPr>
+                  <w:rFonts w:ascii="Cambria Math" w:hAnsi="Cambria Math"/>
+                </w:rPr>
+                <m:t>s</m:t>
+              </m:r>
+            </m:e>
+            <m:sub>
+              <m:r>
+                <w:rPr>
+                  <w:rFonts w:ascii="Cambria Math" w:hAnsi="Cambria Math"/>
+                </w:rPr>
+                <m:t>θ</m:t>
+              </m:r>
+            </m:sub>
+          </m:sSub>
+          <m:d>
+            <m:dPr>
+              <m:ctrlPr>
+                <w:rPr>
+                  <w:rFonts w:ascii="Cambria Math" w:hAnsi="Cambria Math"/>
+                  <w:i/>
+                </w:rPr>
+              </m:ctrlPr>
+            </m:dPr>
+            <m:e>
+              <m:r>
+                <w:rPr>
+                  <w:rFonts w:ascii="Cambria Math" w:hAnsi="Cambria Math"/>
+                </w:rPr>
+                <m:t>x,t</m:t>
+              </m:r>
+            </m:e>
+          </m:d>
+          <m:r>
+            <w:rPr>
+              <w:rFonts w:ascii="Cambria Math" w:hAnsi="Cambria Math"/>
+            </w:rPr>
+            <m:t>≈</m:t>
+          </m:r>
+          <m:sSub>
+            <m:sSubPr>
+              <m:ctrlPr>
+                <w:rPr>
+                  <w:rFonts w:ascii="Cambria Math" w:hAnsi="Cambria Math"/>
+                  <w:i/>
+                </w:rPr>
+              </m:ctrlPr>
+            </m:sSubPr>
+            <m:e>
+              <m:r>
+                <m:rPr>
+                  <m:sty m:val="p"/>
+                </m:rPr>
+                <w:rPr>
+                  <w:rFonts w:ascii="Cambria Math" w:hAnsi="Cambria Math"/>
+                </w:rPr>
+                <m:t>∇</m:t>
+              </m:r>
+            </m:e>
+            <m:sub>
+              <m:r>
+                <w:rPr>
+                  <w:rFonts w:ascii="Cambria Math" w:hAnsi="Cambria Math"/>
+                </w:rPr>
+                <m:t>x</m:t>
+              </m:r>
+            </m:sub>
+          </m:sSub>
+          <m:func>
+            <m:funcPr>
+              <m:ctrlPr>
+                <w:rPr>
+                  <w:rFonts w:ascii="Cambria Math" w:hAnsi="Cambria Math"/>
+                  <w:i/>
+                </w:rPr>
+              </m:ctrlPr>
+            </m:funcPr>
+            <m:fName>
+              <m:r>
+                <m:rPr>
+                  <m:sty m:val="p"/>
+                </m:rPr>
+                <w:rPr>
+                  <w:rFonts w:ascii="Cambria Math" w:hAnsi="Cambria Math"/>
+                </w:rPr>
+                <m:t>log</m:t>
+              </m:r>
+            </m:fName>
+            <m:e>
+              <m:sSub>
+                <m:sSubPr>
+                  <m:ctrlPr>
+                    <w:rPr>
+                      <w:rFonts w:ascii="Cambria Math" w:hAnsi="Cambria Math"/>
+                      <w:i/>
+                    </w:rPr>
+                  </m:ctrlPr>
+                </m:sSubPr>
+                <m:e>
+                  <m:r>
+                    <w:rPr>
+                      <w:rFonts w:ascii="Cambria Math" w:hAnsi="Cambria Math"/>
+                    </w:rPr>
+                    <m:t>p</m:t>
+                  </m:r>
+                </m:e>
+                <m:sub>
+                  <m:r>
+                    <w:rPr>
+                      <w:rFonts w:ascii="Cambria Math" w:hAnsi="Cambria Math"/>
+                    </w:rPr>
+                    <m:t>t</m:t>
+                  </m:r>
+                </m:sub>
+              </m:sSub>
+              <m:d>
+                <m:dPr>
+                  <m:ctrlPr>
+                    <w:rPr>
+                      <w:rFonts w:ascii="Cambria Math" w:hAnsi="Cambria Math"/>
+                      <w:i/>
+                    </w:rPr>
+                  </m:ctrlPr>
+                </m:dPr>
+                <m:e>
+                  <m:r>
+                    <w:rPr>
+                      <w:rFonts w:ascii="Cambria Math" w:hAnsi="Cambria Math"/>
+                    </w:rPr>
+                    <m:t>x</m:t>
+                  </m:r>
+                </m:e>
+              </m:d>
+            </m:e>
+          </m:func>
+        </m:oMath>
+      </m:oMathPara>
+    </w:p>
+    <w:p>
+      <w:pPr>
+        <w:rPr>
+          <w:i/>
+          <w:rtl/>
+        </w:rPr>
+      </w:pPr>
+      <w:r>
+        <w:rPr>
+          <w:rFonts w:hint="cs"/>
+          <w:i/>
+          <w:rtl/>
+        </w:rPr>
+        <w:t>זה לבד לא מייצר מידע. גנרציה/אימפוטציה משתמשת ב</w:t>
+      </w:r>
+      <w:r>
+        <w:rPr>
+          <w:iCs/>
+        </w:rPr>
+        <w:t>SDE</w:t>
+      </w:r>
+      <w:r>
+        <w:rPr>
+          <w:rFonts w:hint="cs"/>
+          <w:i/>
+          <w:rtl/>
+        </w:rPr>
+        <w:t xml:space="preserve"> בזמן אחורי של אנדרסון:</w:t>
+      </w:r>
+    </w:p>
+    <w:p>
+      <w:pPr>
+        <w:rPr>
+          <w:i/>
+          <w:rtl/>
+        </w:rPr>
+      </w:pPr>
+      <m:oMathPara>
+        <m:oMath>
+          <m:r>
+            <w:rPr>
+              <w:rFonts w:ascii="Cambria Math" w:hAnsi="Cambria Math"/>
+            </w:rPr>
+            <m:t>dx=</m:t>
+          </m:r>
+          <m:d>
+            <m:dPr>
+              <m:ctrlPr>
+                <w:rPr>
+                  <w:rFonts w:ascii="Cambria Math" w:hAnsi="Cambria Math"/>
+                  <w:i/>
+                </w:rPr>
+              </m:ctrlPr>
+            </m:dPr>
+            <m:e>
+              <m:r>
+                <w:rPr>
+                  <w:rFonts w:ascii="Cambria Math" w:hAnsi="Cambria Math"/>
+                </w:rPr>
+                <m:t>f</m:t>
+              </m:r>
+              <m:d>
+                <m:dPr>
+                  <m:ctrlPr>
+                    <w:rPr>
+                      <w:rFonts w:ascii="Cambria Math" w:hAnsi="Cambria Math"/>
+                      <w:i/>
+                    </w:rPr>
+                  </m:ctrlPr>
+                </m:dPr>
+                <m:e>
+                  <m:r>
+                    <w:rPr>
+                      <w:rFonts w:ascii="Cambria Math" w:hAnsi="Cambria Math"/>
+                    </w:rPr>
+                    <m:t>x,t</m:t>
+                  </m:r>
+                </m:e>
+              </m:d>
+              <m:r>
+                <w:rPr>
+                  <w:rFonts w:ascii="Cambria Math" w:hAnsi="Cambria Math"/>
+                </w:rPr>
+                <m:t>-g</m:t>
+              </m:r>
+              <m:sSup>
+                <m:sSupPr>
+                  <m:ctrlPr>
+                    <w:rPr>
+                      <w:rFonts w:ascii="Cambria Math" w:hAnsi="Cambria Math"/>
+                      <w:i/>
+                    </w:rPr>
+                  </m:ctrlPr>
+                </m:sSupPr>
+                <m:e>
+                  <m:d>
+                    <m:dPr>
+                      <m:ctrlPr>
+                        <w:rPr>
+                          <w:rFonts w:ascii="Cambria Math" w:hAnsi="Cambria Math"/>
+                          <w:i/>
+                        </w:rPr>
+                      </m:ctrlPr>
+                    </m:dPr>
+                    <m:e>
+                      <m:r>
+                        <w:rPr>
+                          <w:rFonts w:ascii="Cambria Math" w:hAnsi="Cambria Math"/>
+                        </w:rPr>
+                        <m:t>t</m:t>
+                      </m:r>
+                    </m:e>
+                  </m:d>
+                </m:e>
+                <m:sup>
+                  <m:r>
+                    <w:rPr>
+                      <w:rFonts w:ascii="Cambria Math" w:hAnsi="Cambria Math"/>
+                    </w:rPr>
+                    <m:t>2</m:t>
+                  </m:r>
+                </m:sup>
+              </m:sSup>
+              <m:sSub>
+                <m:sSubPr>
+                  <m:ctrlPr>
+                    <w:rPr>
+                      <w:rFonts w:ascii="Cambria Math" w:hAnsi="Cambria Math"/>
+                      <w:i/>
+                    </w:rPr>
+                  </m:ctrlPr>
+                </m:sSubPr>
+                <m:e>
+                  <m:r>
+                    <w:rPr>
+                      <w:rFonts w:ascii="Cambria Math" w:hAnsi="Cambria Math"/>
+                    </w:rPr>
+                    <m:t>s</m:t>
+                  </m:r>
+                </m:e>
+                <m:sub>
+                  <m:r>
+                    <w:rPr>
+                      <w:rFonts w:ascii="Cambria Math" w:hAnsi="Cambria Math"/>
+                    </w:rPr>
+                    <m:t>θ</m:t>
+                  </m:r>
+                </m:sub>
+              </m:sSub>
+              <m:d>
+                <m:dPr>
+                  <m:ctrlPr>
+                    <w:rPr>
+                      <w:rFonts w:ascii="Cambria Math" w:hAnsi="Cambria Math"/>
+                      <w:i/>
+                    </w:rPr>
+                  </m:ctrlPr>
+                </m:dPr>
+                <m:e>
+                  <m:r>
+                    <w:rPr>
+                      <w:rFonts w:ascii="Cambria Math" w:hAnsi="Cambria Math"/>
+                    </w:rPr>
+                    <m:t>x,t</m:t>
+                  </m:r>
+                </m:e>
+              </m:d>
+            </m:e>
+          </m:d>
+          <m:r>
+            <w:rPr>
+              <w:rFonts w:ascii="Cambria Math" w:hAnsi="Cambria Math"/>
+            </w:rPr>
+            <m:t>dt+g</m:t>
+          </m:r>
+          <m:d>
+            <m:dPr>
+              <m:ctrlPr>
+                <w:rPr>
+                  <w:rFonts w:ascii="Cambria Math" w:hAnsi="Cambria Math"/>
+                  <w:i/>
+                </w:rPr>
+              </m:ctrlPr>
+            </m:dPr>
+            <m:e>
+              <m:r>
+                <w:rPr>
+                  <w:rFonts w:ascii="Cambria Math" w:hAnsi="Cambria Math"/>
+                </w:rPr>
+                <m:t>t</m:t>
+              </m:r>
+            </m:e>
+          </m:d>
+          <m:r>
+            <w:rPr>
+              <w:rFonts w:ascii="Cambria Math" w:hAnsi="Cambria Math"/>
+            </w:rPr>
+            <m:t>d</m:t>
+          </m:r>
+          <m:acc>
+            <m:accPr>
+              <m:chr m:val="̅"/>
+              <m:ctrlPr>
+                <w:rPr>
+                  <w:rFonts w:ascii="Cambria Math" w:hAnsi="Cambria Math"/>
+                  <w:i/>
+                </w:rPr>
+              </m:ctrlPr>
+            </m:accPr>
+            <m:e>
+              <m:r>
+                <w:rPr>
+                  <w:rFonts w:ascii="Cambria Math" w:hAnsi="Cambria Math"/>
+                </w:rPr>
+                <m:t>W</m:t>
+              </m:r>
+            </m:e>
+          </m:acc>
+        </m:oMath>
+      </m:oMathPara>
+    </w:p>
+    <w:p>
+      <w:pPr>
+        <w:rPr>
+          <w:i/>
+          <w:rtl/>
+        </w:rPr>
+      </w:pPr>
+      <w:r>
+        <w:rPr>
+          <w:rFonts w:hint="cs"/>
+          <w:i/>
+          <w:rtl/>
+        </w:rPr>
+        <w:t xml:space="preserve">שרץ מ </w:t>
+      </w:r>
+      <m:oMath>
+        <m:r>
+          <w:rPr>
+            <w:rFonts w:ascii="Cambria Math" w:hAnsi="Cambria Math"/>
+          </w:rPr>
+          <m:t>t=T</m:t>
+        </m:r>
+      </m:oMath>
+      <w:r>
+        <w:rPr>
+          <w:rFonts w:hint="cs"/>
+          <w:i/>
+          <w:rtl/>
+        </w:rPr>
+        <w:t xml:space="preserve"> ל </w:t>
+      </w:r>
+      <m:oMath>
+        <m:r>
+          <w:rPr>
+            <w:rFonts w:ascii="Cambria Math" w:hAnsi="Cambria Math"/>
+          </w:rPr>
+          <m:t>t≈0</m:t>
+        </m:r>
+      </m:oMath>
+      <w:r>
+        <w:rPr>
+          <w:rFonts w:hint="cs"/>
+          <w:i/>
+          <w:rtl/>
+        </w:rPr>
+        <w:t xml:space="preserve">, עם </w:t>
+      </w:r>
+      <m:oMath>
+        <m:r>
+          <w:rPr>
+            <w:rFonts w:ascii="Cambria Math" w:hAnsi="Cambria Math"/>
+          </w:rPr>
+          <m:t>f=-</m:t>
+        </m:r>
+        <m:f>
+          <m:fPr>
+            <m:ctrlPr>
+              <w:rPr>
+                <w:rFonts w:ascii="Cambria Math" w:hAnsi="Cambria Math"/>
+                <w:i/>
+              </w:rPr>
+            </m:ctrlPr>
+          </m:fPr>
+          <m:num>
+            <m:r>
+              <w:rPr>
+                <w:rFonts w:ascii="Cambria Math" w:hAnsi="Cambria Math"/>
+              </w:rPr>
+              <m:t>1</m:t>
+            </m:r>
+          </m:num>
+          <m:den>
+            <m:r>
+              <w:rPr>
+                <w:rFonts w:ascii="Cambria Math" w:hAnsi="Cambria Math"/>
+              </w:rPr>
+              <m:t>2</m:t>
+            </m:r>
+          </m:den>
+        </m:f>
+        <m:r>
+          <w:rPr>
+            <w:rFonts w:ascii="Cambria Math" w:hAnsi="Cambria Math"/>
+          </w:rPr>
+          <m:t>βx</m:t>
+        </m:r>
+      </m:oMath>
+      <w:r>
+        <w:rPr>
+          <w:rFonts w:hint="cs"/>
+          <w:i/>
+          <w:rtl/>
+        </w:rPr>
+        <w:t xml:space="preserve"> ו </w:t>
+      </w:r>
+      <m:oMath>
+        <m:r>
+          <w:rPr>
+            <w:rFonts w:ascii="Cambria Math" w:hAnsi="Cambria Math"/>
+          </w:rPr>
+          <m:t>g=</m:t>
+        </m:r>
+        <m:rad>
+          <m:radPr>
+            <m:degHide m:val="1"/>
+            <m:ctrlPr>
+              <w:rPr>
+                <w:rFonts w:ascii="Cambria Math" w:hAnsi="Cambria Math"/>
+                <w:i/>
+              </w:rPr>
+            </m:ctrlPr>
+          </m:radPr>
+          <m:deg/>
+          <m:e>
+            <m:r>
+              <w:rPr>
+                <w:rFonts w:ascii="Cambria Math" w:hAnsi="Cambria Math"/>
+              </w:rPr>
+              <m:t>β</m:t>
+            </m:r>
+          </m:e>
+        </m:rad>
+      </m:oMath>
+      <w:r>
+        <w:rPr>
+          <w:rFonts w:hint="cs"/>
+          <w:i/>
+          <w:rtl/>
+        </w:rPr>
+        <w:t xml:space="preserve">. הקוד מבצע אינטגרציה על משוואה זו בקואורדינטת הזמן האחורי </w:t>
+      </w:r>
+      <m:oMath>
+        <m:r>
+          <w:rPr>
+            <w:rFonts w:ascii="Cambria Math" w:hAnsi="Cambria Math"/>
+          </w:rPr>
+          <m:t>τ=T-t</m:t>
+        </m:r>
+      </m:oMath>
+      <w:r>
+        <w:rPr>
+          <w:rFonts w:hint="cs"/>
+          <w:i/>
+          <w:rtl/>
+        </w:rPr>
+        <w:t xml:space="preserve"> באמצעות </w:t>
+      </w:r>
+      <w:r>
+        <w:rPr>
+          <w:iCs/>
+        </w:rPr>
+        <w:t>Diffrax</w:t>
+      </w:r>
+      <w:r>
+        <w:rPr>
+          <w:rFonts w:hint="cs"/>
+          <w:i/>
+          <w:rtl/>
+        </w:rPr>
+        <w:t xml:space="preserve">, בעזרת </w:t>
+      </w:r>
+      <w:r>
+        <w:rPr>
+          <w:iCs/>
+        </w:rPr>
+        <w:t>VPSDE.reverse_drift</w:t>
+      </w:r>
+      <w:r>
+        <w:rPr>
+          <w:rFonts w:hint="cs"/>
+          <w:i/>
+          <w:rtl/>
+        </w:rPr>
+        <w:t>.</w:t>
+      </w:r>
+    </w:p>
+    <w:p>
+      <w:pPr>
+        <w:rPr>
+          <w:i/>
+          <w:rtl/>
+        </w:rPr>
+      </w:pPr>
+      <w:r>
+        <w:rPr>
+          <w:rFonts w:hint="cs"/>
+          <w:i/>
+          <w:rtl/>
+        </w:rPr>
+        <w:t>[להוסיף למה זה משנה מתמטית? חשיבות פונקציונלית?]</w:t>
+      </w:r>
+    </w:p>
+    <w:p>
+      <w:pPr>
+        <w:rPr>
+          <w:i/>
+          <w:rtl/>
+        </w:rPr>
+      </w:pPr>
+      <w:r>
+        <w:rPr>
+          <w:b/>
+          <w:bCs/>
+          <w:iCs/>
+          <w:u w:val="single"/>
+        </w:rPr>
+        <w:t>WP6</w:t>
+      </w:r>
+      <w:r>
+        <w:rPr>
+          <w:rFonts w:hint="cs"/>
+          <w:iCs/>
+          <w:rtl/>
+        </w:rPr>
+        <w:t xml:space="preserve"> </w:t>
+      </w:r>
+      <w:r>
+        <w:rPr>
+          <w:i/>
+          <w:rtl/>
+        </w:rPr>
+        <w:t>–</w:t>
+      </w:r>
+      <w:r>
+        <w:rPr>
+          <w:rFonts w:hint="cs"/>
+          <w:i/>
+          <w:rtl/>
+        </w:rPr>
+        <w:t xml:space="preserve"> חבילה זו היא שכבת הדבק והראיות מעל ל </w:t>
+      </w:r>
+      <w:r>
+        <w:rPr>
+          <w:iCs/>
+        </w:rPr>
+        <w:t>WP0-WP5</w:t>
+      </w:r>
+      <w:r>
+        <w:rPr>
+          <w:rFonts w:hint="cs"/>
+          <w:i/>
+          <w:rtl/>
+        </w:rPr>
+        <w:t xml:space="preserve">. חבילה זו מקשרת את ה </w:t>
+      </w:r>
+      <w:r>
+        <w:rPr>
+          <w:iCs/>
+        </w:rPr>
+        <w:t>toy stack</w:t>
+      </w:r>
+      <w:r>
+        <w:rPr>
+          <w:rFonts w:hint="cs"/>
+          <w:i/>
+          <w:rtl/>
+        </w:rPr>
+        <w:t xml:space="preserve"> אל תוך דמו שניתן להריץ, ואז נותנת ניקוד וגרפים עבור התוצאה.</w:t>
+      </w:r>
+    </w:p>
+    <w:p>
+      <w:pPr>
+        <w:rPr>
+          <w:i/>
+          <w:rtl/>
+        </w:rPr>
+      </w:pPr>
+      <w:r>
+        <w:rPr>
+          <w:i/>
+          <w:noProof/>
+          <w:rtl/>
+        </w:rPr>
+        <w:drawing>
+          <wp:inline distT="0" distB="0" distL="0" distR="0" wp14:anchorId="1FB343E2" wp14:editId="0B081504">
+            <wp:extent cx="5731510" cy="4400550"/>
+            <wp:effectExtent l="0" t="0" r="2540" b="0"/>
+            <wp:docPr id="942066692" name="Picture 1"/>
+            <wp:cNvGraphicFramePr>
+              <a:graphicFrameLocks xmlns:a="http://schemas.openxmlformats.org/drawingml/2006/main" noChangeAspect="1"/>
+            </wp:cNvGraphicFramePr>
+            <a:graphic xmlns:a="http://schemas.openxmlformats.org/drawingml/2006/main">
+              <a:graphicData uri="http://schemas.openxmlformats.org/drawingml/2006/picture">
+                <pic:pic xmlns:pic="http://schemas.openxmlformats.org/drawingml/2006/picture">
+                  <pic:nvPicPr>
+                    <pic:cNvPr id="942066692" name=""/>
+                    <pic:cNvPicPr/>
+                  </pic:nvPicPr>
+                  <pic:blipFill>
+                    <a:blip r:embed="rId15"/>
+                    <a:stretch>
+                      <a:fillRect/>
+                    </a:stretch>
+                  </pic:blipFill>
+                  <pic:spPr>
+                    <a:xfrm>
+                      <a:off x="0" y="0"/>
+                      <a:ext cx="5731510" cy="4400550"/>
+                    </a:xfrm>
+                    <a:prstGeom prst="rect">
+                      <a:avLst/>
+                    </a:prstGeom>
+                  </pic:spPr>
+                </pic:pic>
+              </a:graphicData>
+            </a:graphic>
+          </wp:inline>
+        </w:drawing>
+      </w:r>
+    </w:p>
+    <w:p>
+      <w:pPr>
+        <w:rPr>
+          <w:rtl/>
+        </w:rPr>
+      </w:pPr>
+    </w:p>
+    <w:p>
+      <w:pPr>
+        <w:rPr>
+          <w:rtl/>
+        </w:rPr>
+      </w:pPr>
+    </w:p>
+    <w:p>
+      <w:pPr>
+        <w:rPr>
+          <w:rFonts w:hint="cs"/>
+          <w:rtl/>
+        </w:rPr>
+      </w:pPr>
+      <w:r>
+        <w:rPr>
+          <w:rFonts w:hint="cs"/>
+          <w:rtl/>
+        </w:rPr>
+        <w:lastRenderedPageBreak/>
+        <w:t xml:space="preserve">עד ל </w:t>
+      </w:r>
+      <w:r>
+        <w:t>WP5</w:t>
+      </w:r>
+      <w:r>
+        <w:rPr>
+          <w:rFonts w:hint="cs"/>
+          <w:rtl/>
+        </w:rPr>
+        <w:t xml:space="preserve"> היו לנו חלקים: גנרטורים, מאסקים, מד"ס, רשת ניקוד, לולאת </w:t>
+      </w:r>
+      <w:r>
+        <w:t>DSM</w:t>
+      </w:r>
+      <w:r>
+        <w:rPr>
+          <w:rFonts w:hint="cs"/>
+          <w:rtl/>
+        </w:rPr>
+        <w:t>, ו</w:t>
+      </w:r>
+      <w:r>
+        <w:t>Diffrax imputer</w:t>
+      </w:r>
+      <w:r>
+        <w:rPr>
+          <w:rFonts w:hint="cs"/>
+          <w:i/>
+          <w:iCs/>
+          <w:rtl/>
+        </w:rPr>
+        <w:t xml:space="preserve">. </w:t>
+      </w:r>
+      <w:r>
+        <w:rPr>
+          <w:rFonts w:hint="cs"/>
+          <w:rtl/>
+        </w:rPr>
+        <w:t xml:space="preserve">מה ש </w:t>
+      </w:r>
+      <w:r>
+        <w:t>WP6</w:t>
+      </w:r>
+      <w:r>
+        <w:rPr>
+          <w:rFonts w:hint="cs"/>
+          <w:rtl/>
+        </w:rPr>
+        <w:t xml:space="preserve"> בודק זה אם כל המסלול עובד, והאם נוכל להראות זאת?</w:t>
+      </w:r>
+    </w:p>
+    <w:p>
+      <w:pPr>
+        <w:rPr>
+          <w:rtl/>
+        </w:rPr>
+      </w:pPr>
+    </w:p>
+    <w:p>
+      <w:pPr>
+        <w:rPr>
+          <w:rtl/>
+        </w:rPr>
+      </w:pPr>
+    </w:p>
+    <w:p>
+      <w:pPr>
+        <w:rPr>
+          <w:rtl/>
+        </w:rPr>
+      </w:pPr>
+    </w:p>
+    <w:p>
+      <w:pPr>
+        <w:rPr>
+          <w:rtl/>
+        </w:rPr>
+      </w:pPr>
+    </w:p>
+    <w:p>
+      <w:pPr>
+        <w:rPr>
+          <w:rtl/>
+        </w:rPr>
+      </w:pPr>
+    </w:p>
+    <w:p>
+      <w:pPr>
+        <w:rPr>
+          <w:rtl/>
+        </w:rPr>
+      </w:pPr>
+    </w:p>
+    <w:p>
+      <w:pPr>
+        <w:rPr>
+          <w:rtl/>
+        </w:rPr>
+      </w:pPr>
+    </w:p>
+    <w:p>
+      <w:pPr>
+        <w:rPr>
+          <w:rtl/>
+        </w:rPr>
+      </w:pPr>
+    </w:p>
+    <w:p>
+      <w:pPr>
+        <w:rPr>
+          <w:rtl/>
+        </w:rPr>
+      </w:pPr>
+    </w:p>
+    <w:p>
+      <w:pPr>
+        <w:rPr>
+          <w:rtl/>
+        </w:rPr>
+      </w:pPr>
+    </w:p>
+    <w:p>
+      <w:pPr>
+        <w:rPr>
+          <w:rtl/>
+        </w:rPr>
+      </w:pPr>
+    </w:p>
+    <w:p>
+      <w:pPr>
+        <w:rPr>
+          <w:rtl/>
+        </w:rPr>
+      </w:pPr>
+    </w:p>
+    <w:p>
+      <w:pPr>
+        <w:rPr>
+          <w:rtl/>
+        </w:rPr>
+      </w:pPr>
+    </w:p>
+    <w:p>
+      <w:pPr>
+        <w:rPr>
+          <w:rtl/>
+        </w:rPr>
+      </w:pPr>
+    </w:p>
+    <w:p>
+      <w:pPr>
+        <w:rPr>
+          <w:rtl/>
+        </w:rPr>
+      </w:pPr>
+    </w:p>
+    <w:p>
+      <w:pPr>
+        <w:rPr>
+          <w:rtl/>
+        </w:rPr>
+      </w:pPr>
+    </w:p>
+    <w:p>
+      <w:pPr>
+        <w:rPr>
+          <w:rtl/>
+        </w:rPr>
+      </w:pPr>
+    </w:p>
+    <w:p>
+      <w:pPr>
+        <w:rPr>
+          <w:rFonts w:hint="cs"/>
+          <w:rtl/>
+        </w:rPr>
+      </w:pPr>
+    </w:p>
+    <w:p>
+      <w:pPr>
+        <w:rPr>
+          <w:rtl/>
+        </w:rPr>
+      </w:pPr>
+    </w:p>
+    <w:p>
+      <w:pPr>
+        <w:rPr>
+          <w:rtl/>
+        </w:rPr>
+      </w:pPr>
+    </w:p>
+    <w:p>
+      <w:pPr>
+        <w:rPr>
+          <w:rtl/>
+        </w:rPr>
+      </w:pPr>
+    </w:p>
+    <w:p>
+      <w:pPr>
+        <w:rPr>
+          <w:rtl/>
+        </w:rPr>
+      </w:pPr>
+    </w:p>
+    <w:p>
+      <w:pPr>
+        <w:rPr>
+          <w:rtl/>
+        </w:rPr>
+      </w:pPr>
+    </w:p>
+    <w:p>
+      <w:pPr>
+        <w:rPr>
+          <w:rtl/>
+        </w:rPr>
+      </w:pPr>
+    </w:p>
+    <w:p>
+      <w:pPr>
+        <w:rPr>
+          <w:rtl/>
+        </w:rPr>
+      </w:pPr>
+    </w:p>
+    <w:p>
+      <w:pPr>
+        <w:rPr>
+          <w:b/>
+          <w:bCs/>
+          <w:sz w:val="36"/>
+          <w:szCs w:val="36"/>
+          <w:u w:val="single"/>
+          <w:rtl/>
+        </w:rPr>
+      </w:pPr>
+      <w:r>
+        <w:rPr>
+          <w:rFonts w:hint="cs"/>
+          <w:b/>
+          <w:bCs/>
+          <w:sz w:val="36"/>
+          <w:szCs w:val="36"/>
+          <w:u w:val="single"/>
+          <w:rtl/>
+        </w:rPr>
+        <w:lastRenderedPageBreak/>
+        <w:t xml:space="preserve">אבן דרך 2 </w:t>
+      </w:r>
+      <w:r>
+        <w:rPr>
+          <w:b/>
+          <w:bCs/>
+          <w:sz w:val="36"/>
+          <w:szCs w:val="36"/>
+          <w:u w:val="single"/>
+          <w:rtl/>
+        </w:rPr>
+        <w:t>–</w:t>
+      </w:r>
+      <w:r>
+        <w:rPr>
+          <w:rFonts w:hint="cs"/>
+          <w:b/>
+          <w:bCs/>
+          <w:sz w:val="36"/>
+          <w:szCs w:val="36"/>
+          <w:u w:val="single"/>
+          <w:rtl/>
+        </w:rPr>
+        <w:t xml:space="preserve"> אימון של נתונים אמיתיים</w:t>
+      </w:r>
+    </w:p>
+    <w:p>
+      <w:pPr>
+        <w:rPr>
+          <w:rFonts w:hint="cs"/>
+        </w:rPr>
+      </w:pPr>
+      <w:r>
+        <w:t>M2</w:t>
+      </w:r>
+      <w:r>
+        <w:rPr>
+          <w:rFonts w:hint="cs"/>
+          <w:rtl/>
+        </w:rPr>
+        <w:t xml:space="preserve"> לוקחת את הלולאה של </w:t>
+      </w:r>
+      <w:r>
+        <w:t>M1</w:t>
+      </w:r>
+      <w:r>
+        <w:rPr>
+          <w:rFonts w:hint="cs"/>
+          <w:rtl/>
+        </w:rPr>
+        <w:t xml:space="preserve"> (</w:t>
+      </w:r>
+      <w:r>
+        <w:t>VP-SDE</w:t>
+      </w:r>
+      <w:r>
+        <w:rPr>
+          <w:rFonts w:hint="cs"/>
+          <w:rtl/>
+        </w:rPr>
+        <w:t xml:space="preserve"> -&gt; רשת ניקוד מותנית -&gt; אימון </w:t>
+      </w:r>
+      <w:r>
+        <w:t>DSM</w:t>
+      </w:r>
+      <w:r>
+        <w:rPr>
+          <w:rFonts w:hint="cs"/>
+          <w:rtl/>
+        </w:rPr>
+        <w:t xml:space="preserve"> -&gt; אימפוטציה לאחור לפי </w:t>
+      </w:r>
+      <w:r>
+        <w:t>Diffrax</w:t>
+      </w:r>
+      <w:r>
+        <w:rPr>
+          <w:rFonts w:hint="cs"/>
+          <w:rtl/>
+        </w:rPr>
+        <w:t xml:space="preserve">) מחוץ ל </w:t>
+      </w:r>
+      <w:r>
+        <w:t>sine/AR</w:t>
+      </w:r>
+      <w:r>
+        <w:rPr>
+          <w:rFonts w:hint="cs"/>
+          <w:rtl/>
+        </w:rPr>
+        <w:t xml:space="preserve"> סינתטי, אל תוך לפחות קבוצת נתונים רבת משתנים אחת. התוצר של </w:t>
+      </w:r>
+      <w:r>
+        <w:t>M2</w:t>
+      </w:r>
+      <w:r>
+        <w:rPr>
+          <w:rFonts w:hint="cs"/>
+          <w:rtl/>
+        </w:rPr>
+        <w:t xml:space="preserve"> הוא מסלול אימון המבוסס על נתונים אמיתיים שניתן לשחזר, עם עקומות אובדן יציבות, וצ'קפוינט שיכול לבצע אימפוטציה על </w:t>
+      </w:r>
+      <w:r>
+        <w:t>validation batch</w:t>
+      </w:r>
+      <w:r>
+        <w:rPr>
+          <w:rFonts w:hint="cs"/>
+          <w:rtl/>
+        </w:rPr>
+        <w:t>.</w:t>
+      </w:r>
+    </w:p>
+    <w:p>
+      <w:pPr>
+        <w:rPr>
+          <w:rtl/>
+        </w:rPr>
+      </w:pPr>
+      <w:r>
+        <w:rPr>
+          <w:b/>
+          <w:bCs/>
+          <w:u w:val="single"/>
+        </w:rPr>
+        <w:t>WP0</w:t>
+      </w:r>
+      <w:r>
+        <w:rPr>
+          <w:rFonts w:hint="cs"/>
+          <w:rtl/>
+        </w:rPr>
+        <w:t xml:space="preserve"> </w:t>
+      </w:r>
+      <w:r>
+        <w:rPr>
+          <w:rtl/>
+        </w:rPr>
+        <w:t>–</w:t>
+      </w:r>
+      <w:r>
+        <w:rPr>
+          <w:rFonts w:hint="cs"/>
+          <w:rtl/>
+        </w:rPr>
+        <w:t xml:space="preserve"> חבילה זו מקפיאה את ה</w:t>
+      </w:r>
+      <w:r>
+        <w:t>contract</w:t>
+      </w:r>
+      <w:r>
+        <w:rPr>
+          <w:rFonts w:hint="cs"/>
+          <w:rtl/>
+        </w:rPr>
+        <w:t xml:space="preserve"> של מידול ו </w:t>
+      </w:r>
+      <w:r>
+        <w:t>evaluation</w:t>
+      </w:r>
+      <w:r>
+        <w:rPr>
+          <w:rFonts w:hint="cs"/>
+          <w:rtl/>
+        </w:rPr>
+        <w:t xml:space="preserve"> כך שניתן ליישם את החבילות הבאות על מטרה קבועה.</w:t>
+      </w:r>
+    </w:p>
+    <w:p>
+      <w:pPr>
+        <w:rPr>
+          <w:rFonts w:hint="cs"/>
+          <w:rtl/>
+        </w:rPr>
+      </w:pPr>
+      <w:r>
+        <w:rPr>
+          <w:rtl/>
+        </w:rPr>
+        <w:drawing>
+          <wp:inline distT="0" distB="0" distL="0" distR="0" wp14:anchorId="5B254119" wp14:editId="0F2765CF">
+            <wp:extent cx="5731510" cy="3020060"/>
+            <wp:effectExtent l="0" t="0" r="2540" b="8890"/>
+            <wp:docPr id="1435585931" name="Picture 1"/>
+            <wp:cNvGraphicFramePr>
+              <a:graphicFrameLocks xmlns:a="http://schemas.openxmlformats.org/drawingml/2006/main" noChangeAspect="1"/>
+            </wp:cNvGraphicFramePr>
+            <a:graphic xmlns:a="http://schemas.openxmlformats.org/drawingml/2006/main">
+              <a:graphicData uri="http://schemas.openxmlformats.org/drawingml/2006/picture">
+                <pic:pic xmlns:pic="http://schemas.openxmlformats.org/drawingml/2006/picture">
+                  <pic:nvPicPr>
+                    <pic:cNvPr id="1435585931" name=""/>
+                    <pic:cNvPicPr/>
+                  </pic:nvPicPr>
+                  <pic:blipFill>
+                    <a:blip r:embed="rId16"/>
+                    <a:stretch>
+                      <a:fillRect/>
+                    </a:stretch>
+                  </pic:blipFill>
+                  <pic:spPr>
+                    <a:xfrm>
+                      <a:off x="0" y="0"/>
+                      <a:ext cx="5731510" cy="3020060"/>
+                    </a:xfrm>
+                    <a:prstGeom prst="rect">
+                      <a:avLst/>
+                    </a:prstGeom>
+                  </pic:spPr>
+                </pic:pic>
+              </a:graphicData>
+            </a:graphic>
+          </wp:inline>
+        </w:drawing>
+      </w:r>
+    </w:p>
+    <w:p>
+      <w:pPr>
+        <w:rPr>
+          <w:rtl/>
+        </w:rPr>
+      </w:pPr>
+      <w:r>
+        <w:rPr>
+          <w:rFonts w:hint="cs"/>
+          <w:rtl/>
+        </w:rPr>
+        <w:t>החבילה חשובה מכמה סיבות:</w:t>
+      </w:r>
+    </w:p>
+    <w:p>
+      <w:pPr>
+        <w:rPr>
+          <w:rtl/>
+        </w:rPr>
+      </w:pPr>
+      <w:r>
+        <w:rPr>
+          <w:rFonts w:hint="cs"/>
+          <w:rtl/>
+        </w:rPr>
+        <w:t xml:space="preserve">1. מונעת סטייה מהמטרה </w:t>
+      </w:r>
+      <w:r>
+        <w:rPr>
+          <w:rtl/>
+        </w:rPr>
+        <w:t>–</w:t>
+      </w:r>
+      <w:r>
+        <w:rPr>
+          <w:rFonts w:hint="cs"/>
+          <w:rtl/>
+        </w:rPr>
+        <w:t xml:space="preserve"> קבוצות נתונים, מטריקות, ומה שנחשב כהצלחה נשמרים לפני הקוד.</w:t>
+      </w:r>
+    </w:p>
+    <w:p>
+      <w:pPr>
+        <w:rPr>
+          <w:rtl/>
+        </w:rPr>
+      </w:pPr>
+      <w:r>
+        <w:rPr>
+          <w:rFonts w:hint="cs"/>
+          <w:rtl/>
+        </w:rPr>
+        <w:t xml:space="preserve">2. שומרת את </w:t>
+      </w:r>
+      <w:r>
+        <w:t>M1</w:t>
+      </w:r>
+      <w:r>
+        <w:rPr>
+          <w:rFonts w:hint="cs"/>
+          <w:rtl/>
+        </w:rPr>
+        <w:t xml:space="preserve"> יציבה </w:t>
+      </w:r>
+      <w:r>
+        <w:rPr>
+          <w:rtl/>
+        </w:rPr>
+        <w:t>–</w:t>
+      </w:r>
+      <w:r>
+        <w:rPr>
+          <w:rFonts w:hint="cs"/>
+          <w:rtl/>
+        </w:rPr>
+        <w:t xml:space="preserve"> אותו </w:t>
+      </w:r>
+      <m:oMath>
+        <m:d>
+          <m:dPr>
+            <m:ctrlPr>
+              <w:rPr>
+                <w:rFonts w:ascii="Cambria Math" w:hAnsi="Cambria Math"/>
+                <w:i/>
+              </w:rPr>
+            </m:ctrlPr>
+          </m:dPr>
+          <m:e>
+            <m:r>
+              <w:rPr>
+                <w:rFonts w:ascii="Cambria Math" w:hAnsi="Cambria Math"/>
+              </w:rPr>
+              <m:t>B,T,F</m:t>
+            </m:r>
+          </m:e>
+        </m:d>
+      </m:oMath>
+      <w:r>
+        <w:rPr>
+          <w:rFonts w:hint="cs"/>
+          <w:rtl/>
+        </w:rPr>
+        <w:t xml:space="preserve">, מאסק, </w:t>
+      </w:r>
+      <w:r>
+        <w:t>DSM-on-targets</w:t>
+      </w:r>
+      <w:r>
+        <w:rPr>
+          <w:rFonts w:hint="cs"/>
+          <w:rtl/>
+        </w:rPr>
+        <w:t xml:space="preserve">, </w:t>
+      </w:r>
+      <w:r>
+        <w:t>VP-SDE</w:t>
+      </w:r>
+      <w:r>
+        <w:rPr>
+          <w:rFonts w:hint="cs"/>
+          <w:rtl/>
+        </w:rPr>
+        <w:t xml:space="preserve">, ושימוש ב </w:t>
+      </w:r>
+      <w:r>
+        <w:t>Diffrax</w:t>
+      </w:r>
+      <w:r>
+        <w:rPr>
+          <w:rFonts w:hint="cs"/>
+          <w:rtl/>
+        </w:rPr>
+        <w:t>.</w:t>
+      </w:r>
+    </w:p>
+    <w:p>
+      <w:pPr>
+        <w:rPr>
+          <w:rtl/>
+        </w:rPr>
+      </w:pPr>
+      <w:r>
+        <w:rPr>
+          <w:rFonts w:hint="cs"/>
+          <w:rtl/>
+        </w:rPr>
+        <w:t>3. חוסמת דליפה או רמאות של מטריקה -  משקללת רק כאשר ה</w:t>
+      </w:r>
+      <w:r>
+        <w:t>ground truth</w:t>
+      </w:r>
+      <w:r>
+        <w:rPr>
+          <w:rFonts w:hint="cs"/>
+          <w:rtl/>
+        </w:rPr>
+        <w:t xml:space="preserve"> קיימת.</w:t>
+      </w:r>
+    </w:p>
+    <w:p>
+      <w:pPr>
+        <w:rPr>
+          <w:rtl/>
+        </w:rPr>
+      </w:pPr>
+      <w:r>
+        <w:rPr>
+          <w:rFonts w:hint="cs"/>
+          <w:rtl/>
+        </w:rPr>
+        <w:t xml:space="preserve">4. מפרידה את </w:t>
+      </w:r>
+      <w:r>
+        <w:t>M2</w:t>
+      </w:r>
+      <w:r>
+        <w:rPr>
+          <w:rFonts w:hint="cs"/>
+          <w:rtl/>
+        </w:rPr>
+        <w:t xml:space="preserve"> מ </w:t>
+      </w:r>
+      <w:r>
+        <w:t>M3</w:t>
+      </w:r>
+      <w:r>
+        <w:rPr>
+          <w:rFonts w:hint="cs"/>
+          <w:rtl/>
+        </w:rPr>
+        <w:t xml:space="preserve"> </w:t>
+      </w:r>
+      <w:r>
+        <w:rPr>
+          <w:rtl/>
+        </w:rPr>
+        <w:t>–</w:t>
+      </w:r>
+      <w:r>
+        <w:rPr>
+          <w:rFonts w:hint="cs"/>
+          <w:rtl/>
+        </w:rPr>
+        <w:t xml:space="preserve"> אימון + שקלול מבצעות שקלול עכשיו. טבלאות עבור </w:t>
+      </w:r>
+      <w:r>
+        <w:t>LOCF/linear/CSDI</w:t>
+      </w:r>
+      <w:r>
+        <w:rPr>
+          <w:rFonts w:hint="cs"/>
+          <w:rtl/>
+        </w:rPr>
+        <w:t xml:space="preserve"> יוצבו מאוחר יותר.</w:t>
+      </w:r>
+    </w:p>
+    <w:p>
+      <w:pPr>
+        <w:rPr>
+          <w:rtl/>
+        </w:rPr>
+      </w:pPr>
+      <w:r>
+        <w:rPr>
+          <w:rFonts w:hint="cs"/>
+          <w:rtl/>
+        </w:rPr>
+        <w:t>אנו בוחרים להשתמש בקבוצת הנתונים:</w:t>
+      </w:r>
+    </w:p>
+    <w:p>
+      <w:pPr>
+        <w:bidi w:val="0"/>
+      </w:pPr>
+      <w:r>
+        <w:t>UCI Beijing Multi-Site Air-Quality Data</w:t>
+      </w:r>
+    </w:p>
+    <w:p>
+      <w:pPr>
+        <w:rPr>
+          <w:rtl/>
+        </w:rPr>
+      </w:pPr>
+      <w:r>
+        <w:rPr>
+          <w:rFonts w:hint="cs"/>
+          <w:rtl/>
+        </w:rPr>
+        <w:lastRenderedPageBreak/>
+        <w:t>קבוצה זו היא ציבורית, בעלת מזהמים רבי משתנים + תחזית מזג אוויר, פערים שנמצאים כבר בקבוצה, תדירות שעתית שנותנת חלונות בעלות רשת-רגולרית קלות.</w:t>
+      </w:r>
+    </w:p>
+    <w:p>
+      <w:pPr>
+        <w:rPr>
+          <w:rtl/>
+        </w:rPr>
+      </w:pPr>
+      <w:r>
+        <w:rPr>
+          <w:b/>
+          <w:bCs/>
+          <w:u w:val="single"/>
+        </w:rPr>
+        <w:t>WP1</w:t>
+      </w:r>
+      <w:r>
+        <w:rPr>
+          <w:rFonts w:hint="cs"/>
+          <w:rtl/>
+        </w:rPr>
+        <w:t xml:space="preserve"> </w:t>
+      </w:r>
+      <w:r>
+        <w:rPr>
+          <w:rtl/>
+        </w:rPr>
+        <w:t>–</w:t>
+      </w:r>
+      <w:r>
+        <w:rPr>
+          <w:rFonts w:hint="cs"/>
+          <w:rtl/>
+        </w:rPr>
+        <w:t xml:space="preserve"> חבילה זו היא המצע של נתונים אמיתיים עבור </w:t>
+      </w:r>
+      <w:r>
+        <w:t>M2</w:t>
+      </w:r>
+      <w:r>
+        <w:rPr>
+          <w:rFonts w:hint="cs"/>
+          <w:rtl/>
+        </w:rPr>
+        <w:t>. היא הופכת את ה</w:t>
+      </w:r>
+      <w:r>
+        <w:t>CSV</w:t>
+      </w:r>
+      <w:r>
+        <w:rPr>
+          <w:rFonts w:hint="cs"/>
+          <w:rtl/>
+        </w:rPr>
+        <w:t xml:space="preserve"> של </w:t>
+      </w:r>
+      <w:r>
+        <w:t>UCI Beijing Multi-Site air-quality</w:t>
+      </w:r>
+      <w:r>
+        <w:rPr>
+          <w:rFonts w:hint="cs"/>
+          <w:rtl/>
+        </w:rPr>
+        <w:t xml:space="preserve"> אל תוך אותם</w:t>
+      </w:r>
+      <w:r>
+        <w:t>tensor contracts</w:t>
+      </w:r>
+      <w:r>
+        <w:rPr>
+          <w:rFonts w:hint="cs"/>
+          <w:rtl/>
+        </w:rPr>
+        <w:t xml:space="preserve"> של </w:t>
+      </w:r>
+      <w:r>
+        <w:t>M1</w:t>
+      </w:r>
+      <w:r>
+        <w:rPr>
+          <w:rFonts w:hint="cs"/>
+          <w:rtl/>
+        </w:rPr>
+        <w:t xml:space="preserve"> שכבר השתמשנו בהם: ערכי </w:t>
+      </w:r>
+      <m:oMath>
+        <m:d>
+          <m:dPr>
+            <m:ctrlPr>
+              <w:rPr>
+                <w:rFonts w:ascii="Cambria Math" w:hAnsi="Cambria Math"/>
+                <w:i/>
+              </w:rPr>
+            </m:ctrlPr>
+          </m:dPr>
+          <m:e>
+            <m:r>
+              <w:rPr>
+                <w:rFonts w:ascii="Cambria Math" w:hAnsi="Cambria Math"/>
+              </w:rPr>
+              <m:t>B,T,F</m:t>
+            </m:r>
+          </m:e>
+        </m:d>
+      </m:oMath>
+      <w:r>
+        <w:rPr>
+          <w:rFonts w:hint="cs"/>
+          <w:rtl/>
+        </w:rPr>
+        <w:t>, מאסקים (1 = נצפה, 0 = חסר), ומשלים מקום 0.0 על תאים חסרים.</w:t>
+      </w:r>
+    </w:p>
+    <w:p>
+      <w:pPr>
+        <w:rPr>
+          <w:rFonts w:hint="cs"/>
+          <w:rtl/>
+        </w:rPr>
+      </w:pPr>
+      <w:r>
+        <w:rPr>
+          <w:rtl/>
+        </w:rPr>
+        <w:drawing>
+          <wp:inline distT="0" distB="0" distL="0" distR="0" wp14:anchorId="73ADF3C1" wp14:editId="1E0A02C8">
+            <wp:extent cx="5731510" cy="1910080"/>
+            <wp:effectExtent l="0" t="0" r="2540" b="0"/>
+            <wp:docPr id="1157061870" name="Picture 1"/>
+            <wp:cNvGraphicFramePr>
+              <a:graphicFrameLocks xmlns:a="http://schemas.openxmlformats.org/drawingml/2006/main" noChangeAspect="1"/>
+            </wp:cNvGraphicFramePr>
+            <a:graphic xmlns:a="http://schemas.openxmlformats.org/drawingml/2006/main">
+              <a:graphicData uri="http://schemas.openxmlformats.org/drawingml/2006/picture">
+                <pic:pic xmlns:pic="http://schemas.openxmlformats.org/drawingml/2006/picture">
+                  <pic:nvPicPr>
+                    <pic:cNvPr id="1157061870" name=""/>
+                    <pic:cNvPicPr/>
+                  </pic:nvPicPr>
+                  <pic:blipFill>
+                    <a:blip r:embed="rId17"/>
+                    <a:stretch>
+                      <a:fillRect/>
+                    </a:stretch>
+                  </pic:blipFill>
+                  <pic:spPr>
+                    <a:xfrm>
+                      <a:off x="0" y="0"/>
+                      <a:ext cx="5731510" cy="1910080"/>
+                    </a:xfrm>
+                    <a:prstGeom prst="rect">
+                      <a:avLst/>
+                    </a:prstGeom>
+                  </pic:spPr>
+                </pic:pic>
+              </a:graphicData>
+            </a:graphic>
+          </wp:inline>
+        </w:drawing>
+      </w:r>
+    </w:p>
+    <w:p>
+      <w:pPr>
+        <w:rPr>
+          <w:rtl/>
+        </w:rPr>
+      </w:pPr>
+      <w:r>
+        <w:rPr>
+          <w:rFonts w:hint="cs"/>
+          <w:rtl/>
+        </w:rPr>
+        <w:t xml:space="preserve">הדרך שבה ה </w:t>
+      </w:r>
+      <w:r>
+        <w:t>pipeline</w:t>
+      </w:r>
+      <w:r>
+        <w:rPr>
+          <w:rFonts w:hint="cs"/>
+          <w:rtl/>
+        </w:rPr>
+        <w:t xml:space="preserve"> מתנהג:</w:t>
+      </w:r>
+    </w:p>
+    <w:p>
+      <w:pPr>
+        <w:rPr>
+          <w:rtl/>
+        </w:rPr>
+      </w:pPr>
+      <w:r>
+        <w:rPr>
+          <w:rFonts w:hint="cs"/>
+          <w:rtl/>
+        </w:rPr>
+        <w:t xml:space="preserve">1. קרא את ה </w:t>
+      </w:r>
+      <w:r>
+        <w:t>PRSA CSVs</w:t>
+      </w:r>
+      <w:r>
+        <w:rPr>
+          <w:rFonts w:hint="cs"/>
+          <w:rtl/>
+        </w:rPr>
+        <w:t xml:space="preserve"> (</w:t>
+      </w:r>
+      <w:r>
+        <w:t>PM2.5…I3, station id, year/month/day/hour</w:t>
+      </w:r>
+      <w:r>
+        <w:rPr>
+          <w:rFonts w:hint="cs"/>
+          <w:rtl/>
+        </w:rPr>
+        <w:t>)</w:t>
+      </w:r>
+    </w:p>
+    <w:p>
+      <w:pPr>
+        <w:rPr>
+          <w:rtl/>
+        </w:rPr>
+      </w:pPr>
+      <w:r>
+        <w:rPr>
+          <w:rFonts w:hint="cs"/>
+          <w:rtl/>
+        </w:rPr>
+        <w:t>2. דיגום מחדש לרשת שעתית רגולרית (הנצפה האחרון ב</w:t>
+      </w:r>
+      <w:r>
+        <w:t>bin</w:t>
+      </w:r>
+      <w:r>
+        <w:rPr>
+          <w:rFonts w:hint="cs"/>
+          <w:rtl/>
+        </w:rPr>
+        <w:t>, אם ה</w:t>
+      </w:r>
+      <w:r>
+        <w:t>bin</w:t>
+      </w:r>
+      <w:r>
+        <w:rPr>
+          <w:rFonts w:hint="cs"/>
+          <w:rtl/>
+        </w:rPr>
+        <w:t xml:space="preserve"> ריק, אז </w:t>
+      </w:r>
+      <w:r>
+        <w:t>native</w:t>
+      </w:r>
+      <w:r>
+        <w:rPr>
+          <w:rFonts w:hint="cs"/>
+          <w:rtl/>
+        </w:rPr>
+        <w:t xml:space="preserve"> חסר).</w:t>
+      </w:r>
+    </w:p>
+    <w:p>
+      <w:pPr>
+        <w:rPr>
+          <w:rtl/>
+        </w:rPr>
+      </w:pPr>
+      <w:r>
+        <w:rPr>
+          <w:rFonts w:hint="cs"/>
+          <w:rtl/>
+        </w:rPr>
+        <w:t xml:space="preserve">3. לחתוך חלונות שהם </w:t>
+      </w:r>
+      <w:r>
+        <w:t>non-overlaping</w:t>
+      </w:r>
+      <w:r>
+        <w:rPr>
+          <w:rFonts w:hint="cs"/>
+          <w:rtl/>
+        </w:rPr>
+        <w:t xml:space="preserve"> מאורך </w:t>
+      </w:r>
+      <w:r>
+        <w:t>T</w:t>
+      </w:r>
+      <w:r>
+        <w:rPr>
+          <w:rFonts w:hint="cs"/>
+          <w:rtl/>
+        </w:rPr>
+        <w:t xml:space="preserve">, כדי לקבל </w:t>
+      </w:r>
+      <m:oMath>
+        <m:d>
+          <m:dPr>
+            <m:ctrlPr>
+              <w:rPr>
+                <w:rFonts w:ascii="Cambria Math" w:hAnsi="Cambria Math"/>
+                <w:i/>
+              </w:rPr>
+            </m:ctrlPr>
+          </m:dPr>
+          <m:e>
+            <m:r>
+              <w:rPr>
+                <w:rFonts w:ascii="Cambria Math" w:hAnsi="Cambria Math"/>
+              </w:rPr>
+              <m:t>N,T,F</m:t>
+            </m:r>
+          </m:e>
+        </m:d>
+      </m:oMath>
+      <w:r>
+        <w:rPr>
+          <w:rFonts w:hint="cs"/>
+          <w:rtl/>
+        </w:rPr>
+        <w:t xml:space="preserve"> ערכים, </w:t>
+      </w:r>
+      <w:r>
+        <w:t>native masks</w:t>
+      </w:r>
+      <w:r>
+        <w:rPr>
+          <w:rFonts w:hint="cs"/>
+          <w:rtl/>
+        </w:rPr>
+        <w:t xml:space="preserve">, ו </w:t>
+      </w:r>
+      <w:r>
+        <w:t>entity ids</w:t>
+      </w:r>
+      <w:r>
+        <w:rPr>
+          <w:rFonts w:hint="cs"/>
+          <w:rtl/>
+        </w:rPr>
+        <w:t>.</w:t>
+      </w:r>
+    </w:p>
+    <w:p>
+      <w:pPr>
+        <w:rPr>
+          <w:rtl/>
+        </w:rPr>
+      </w:pPr>
+      <w:r>
+        <w:rPr>
+          <w:rFonts w:hint="cs"/>
+          <w:rtl/>
+        </w:rPr>
+        <w:t xml:space="preserve">4. חלוקה של </w:t>
+      </w:r>
+      <w:r>
+        <w:t>train/val/test</w:t>
+      </w:r>
+      <w:r>
+        <w:rPr>
+          <w:rFonts w:hint="cs"/>
+          <w:rtl/>
+        </w:rPr>
+        <w:t xml:space="preserve"> באופן דטרמיניסטי.</w:t>
+      </w:r>
+    </w:p>
+    <w:p>
+      <w:pPr>
+        <w:rPr>
+          <w:rtl/>
+        </w:rPr>
+      </w:pPr>
+    </w:p>
+    <w:p>
+      <w:pPr>
+        <w:rPr>
+          <w:rtl/>
+        </w:rPr>
+      </w:pPr>
+      <w:r>
+        <w:rPr>
+          <w:rFonts w:hint="cs"/>
+          <w:rtl/>
+        </w:rPr>
+        <w:t xml:space="preserve">לולא </w:t>
+      </w:r>
+      <w:r>
+        <w:t>WP1</w:t>
+      </w:r>
+      <w:r>
+        <w:rPr>
+          <w:rFonts w:hint="cs"/>
+          <w:rtl/>
+        </w:rPr>
+        <w:t xml:space="preserve">, ל </w:t>
+      </w:r>
+      <w:r>
+        <w:t>M2</w:t>
+      </w:r>
+      <w:r>
+        <w:rPr>
+          <w:rFonts w:hint="cs"/>
+          <w:rtl/>
+        </w:rPr>
+        <w:t xml:space="preserve"> אין מסלול הוגן מ "</w:t>
+      </w:r>
+      <w:r>
+        <w:t>CSV</w:t>
+      </w:r>
+      <w:r>
+        <w:rPr>
+          <w:rFonts w:hint="cs"/>
+          <w:rtl/>
+        </w:rPr>
+        <w:t xml:space="preserve"> אמיתי מבולגן" ל "אימון </w:t>
+      </w:r>
+      <w:r>
+        <w:t>DSM</w:t>
+      </w:r>
+      <w:r>
+        <w:rPr>
+          <w:rFonts w:hint="cs"/>
+          <w:rtl/>
+        </w:rPr>
+        <w:t xml:space="preserve"> יציב."</w:t>
+      </w:r>
+    </w:p>
+    <w:p>
+      <w:pPr>
+        <w:rPr>
+          <w:rtl/>
+        </w:rPr>
+      </w:pPr>
+      <w:r>
+        <w:rPr>
+          <w:rFonts w:hint="cs"/>
+          <w:rtl/>
+        </w:rPr>
+        <w:t>[למה חבילה זו היא חשובה?]</w:t>
+      </w:r>
+    </w:p>
+    <w:p>
+      <w:pPr>
+        <w:rPr>
+          <w:rtl/>
+        </w:rPr>
+      </w:pPr>
+      <w:r>
+        <w:rPr>
+          <w:b/>
+          <w:bCs/>
+          <w:u w:val="single"/>
+        </w:rPr>
+        <w:t>WP2</w:t>
+      </w:r>
+      <w:r>
+        <w:rPr>
+          <w:rFonts w:hint="cs"/>
+          <w:rtl/>
+        </w:rPr>
+        <w:t xml:space="preserve"> </w:t>
+      </w:r>
+      <w:r>
+        <w:rPr>
+          <w:rtl/>
+        </w:rPr>
+        <w:t>–</w:t>
+      </w:r>
+      <w:r>
+        <w:rPr>
+          <w:rFonts w:hint="cs"/>
+          <w:rtl/>
+        </w:rPr>
+        <w:t xml:space="preserve"> חבילה זו היא הגשר בין החלונות האמיתיים של </w:t>
+      </w:r>
+      <w:r>
+        <w:t>WP1</w:t>
+      </w:r>
+      <w:r>
+        <w:rPr>
+          <w:rFonts w:hint="cs"/>
+          <w:rtl/>
+        </w:rPr>
+        <w:t xml:space="preserve"> והאימון האמיתי של </w:t>
+      </w:r>
+      <w:r>
+        <w:t>WP3</w:t>
+      </w:r>
+      <w:r>
+        <w:rPr>
+          <w:rFonts w:hint="cs"/>
+          <w:rtl/>
+        </w:rPr>
+        <w:t xml:space="preserve">. חבילה זו לא מאמנת או מבצעת אימפוטציה, אלא היא הופכת באטצ'ים אמיתיים לבטוחים וניתנים לשחזור עבור </w:t>
+      </w:r>
+      <w:r>
+        <w:t>M1 SDE/score stack</w:t>
+      </w:r>
+      <w:r>
+        <w:rPr>
+          <w:rFonts w:hint="cs"/>
+          <w:rtl/>
+        </w:rPr>
+        <w:t>.</w:t>
+      </w:r>
+    </w:p>
+    <w:p>
+      <w:pPr>
+        <w:rPr>
+          <w:rFonts w:hint="cs"/>
+          <w:rtl/>
+        </w:rPr>
+      </w:pPr>
+      <w:r>
+        <w:rPr>
+          <w:rtl/>
+        </w:rPr>
+        <w:lastRenderedPageBreak/>
+        <w:drawing>
+          <wp:inline distT="0" distB="0" distL="0" distR="0" wp14:anchorId="22042311" wp14:editId="1EF0A273">
+            <wp:extent cx="5731510" cy="3439795"/>
+            <wp:effectExtent l="0" t="0" r="2540" b="8255"/>
+            <wp:docPr id="1995859874" name="Picture 1"/>
+            <wp:cNvGraphicFramePr>
+              <a:graphicFrameLocks xmlns:a="http://schemas.openxmlformats.org/drawingml/2006/main" noChangeAspect="1"/>
+            </wp:cNvGraphicFramePr>
+            <a:graphic xmlns:a="http://schemas.openxmlformats.org/drawingml/2006/main">
+              <a:graphicData uri="http://schemas.openxmlformats.org/drawingml/2006/picture">
+                <pic:pic xmlns:pic="http://schemas.openxmlformats.org/drawingml/2006/picture">
+                  <pic:nvPicPr>
+                    <pic:cNvPr id="1995859874" name=""/>
+                    <pic:cNvPicPr/>
+                  </pic:nvPicPr>
+                  <pic:blipFill>
+                    <a:blip r:embed="rId18"/>
+                    <a:stretch>
+                      <a:fillRect/>
+                    </a:stretch>
+                  </pic:blipFill>
+                  <pic:spPr>
+                    <a:xfrm>
+                      <a:off x="0" y="0"/>
+                      <a:ext cx="5731510" cy="3439795"/>
+                    </a:xfrm>
+                    <a:prstGeom prst="rect">
+                      <a:avLst/>
+                    </a:prstGeom>
+                  </pic:spPr>
+                </pic:pic>
+              </a:graphicData>
+            </a:graphic>
+          </wp:inline>
+        </w:drawing>
+      </w:r>
+    </w:p>
+    <w:p>
+      <w:pPr>
+        <w:rPr>
+          <w:rtl/>
+        </w:rPr>
+      </w:pPr>
+      <w:r>
+        <w:rPr>
+          <w:rFonts w:hint="cs"/>
+          <w:rtl/>
+        </w:rPr>
+        <w:t xml:space="preserve">לולא </w:t>
+      </w:r>
+      <w:r>
+        <w:t>WP2</w:t>
+      </w:r>
+      <w:r>
+        <w:rPr>
+          <w:rFonts w:hint="cs"/>
+          <w:rtl/>
+        </w:rPr>
+        <w:t xml:space="preserve">, מזהמי בייג'ינג אמיתיים (סקאלות מאוד שונות: </w:t>
+      </w:r>
+      <w:r>
+        <w:t>CO</w:t>
+      </w:r>
+      <w:r>
+        <w:rPr>
+          <w:rFonts w:hint="cs"/>
+          <w:rtl/>
+        </w:rPr>
+        <w:t xml:space="preserve"> נגד </w:t>
+      </w:r>
+      <w:r>
+        <w:t>O3</w:t>
+      </w:r>
+      <w:r>
+        <w:rPr>
+          <w:rFonts w:hint="cs"/>
+          <w:rtl/>
+        </w:rPr>
+        <w:t xml:space="preserve">, וכו') יזינו נתונים גולמיים ל </w:t>
+      </w:r>
+      <w:r>
+        <w:t>VP-SDE/score</w:t>
+      </w:r>
+      <w:r>
+        <w:rPr>
+          <w:rFonts w:hint="cs"/>
+          <w:rtl/>
+        </w:rPr>
+        <w:t xml:space="preserve">. זה גורם ל </w:t>
+      </w:r>
+      <w:r>
+        <w:t>DSM</w:t>
+      </w:r>
+      <w:r>
+        <w:rPr>
+          <w:rFonts w:hint="cs"/>
+          <w:rtl/>
+        </w:rPr>
+        <w:t xml:space="preserve"> שאיננו יציב, </w:t>
+      </w:r>
+      <w:r>
+        <w:t>NaNs</w:t>
+      </w:r>
+      <w:r>
+        <w:rPr>
+          <w:rFonts w:hint="cs"/>
+          <w:rtl/>
+        </w:rPr>
+        <w:t>, ודומיננטיות של פיצ'רים.</w:t>
+      </w:r>
+    </w:p>
+    <w:p>
+      <w:pPr>
+        <w:rPr>
+          <w:rtl/>
+        </w:rPr>
+      </w:pPr>
+      <w:r>
+        <w:t>WP2</w:t>
+      </w:r>
+      <w:r>
+        <w:rPr>
+          <w:rFonts w:hint="cs"/>
+          <w:rtl/>
+        </w:rPr>
+        <w:t xml:space="preserve"> גם לוכד 3 קונטרקטים מדעיים:</w:t>
+      </w:r>
+    </w:p>
+    <w:p>
+      <w:pPr>
+        <w:rPr>
+          <w:rtl/>
+        </w:rPr>
+      </w:pPr>
+      <w:r>
+        <w:rPr>
+          <w:rFonts w:hint="cs"/>
+          <w:rtl/>
+        </w:rPr>
+        <w:t xml:space="preserve">1. אין זליגה </w:t>
+      </w:r>
+      <w:r>
+        <w:rPr>
+          <w:rtl/>
+        </w:rPr>
+        <w:t>–</w:t>
+      </w:r>
+      <w:r>
+        <w:rPr>
+          <w:rFonts w:hint="cs"/>
+          <w:rtl/>
+        </w:rPr>
+        <w:t xml:space="preserve"> נתונים מהאימון בלבד, לא משקלול או מבחן.</w:t>
+      </w:r>
+    </w:p>
+    <w:p>
+      <w:pPr>
+        <w:rPr>
+          <w:rtl/>
+        </w:rPr>
+      </w:pPr>
+      <w:r>
+        <w:rPr>
+          <w:rFonts w:hint="cs"/>
+          <w:rtl/>
+        </w:rPr>
+        <w:t xml:space="preserve">2. אין זיהום חסר </w:t>
+      </w:r>
+      <w:r>
+        <w:rPr>
+          <w:rtl/>
+        </w:rPr>
+        <w:t>–</w:t>
+      </w:r>
+      <w:r>
+        <w:rPr>
+          <w:rFonts w:hint="cs"/>
+          <w:rtl/>
+        </w:rPr>
+        <w:t xml:space="preserve"> אף פעם לא להשתמש בתאים </w:t>
+      </w:r>
+      <w:r>
+        <w:t>m == 0</w:t>
+      </w:r>
+      <w:r>
+        <w:rPr>
+          <w:rFonts w:hint="cs"/>
+          <w:rtl/>
+        </w:rPr>
+        <w:t xml:space="preserve"> בממוצע/סטיית תקן.</w:t>
+      </w:r>
+    </w:p>
+    <w:p>
+      <w:pPr>
+        <w:rPr>
+          <w:rtl/>
+        </w:rPr>
+      </w:pPr>
+      <w:r>
+        <w:rPr>
+          <w:rFonts w:hint="cs"/>
+          <w:rtl/>
+        </w:rPr>
+        <w:t xml:space="preserve">3. מטריקות כנות מאוחר יותר </w:t>
+      </w:r>
+      <w:r>
+        <w:rPr>
+          <w:rtl/>
+        </w:rPr>
+        <w:t>–</w:t>
+      </w:r>
+      <w:r>
+        <w:rPr>
+          <w:rFonts w:hint="cs"/>
+          <w:rtl/>
+        </w:rPr>
+        <w:t xml:space="preserve"> אימון במרחב מנורמל, דיווח של יחידות פיזיקליות.</w:t>
+      </w:r>
+    </w:p>
+    <w:p>
+      <w:pPr>
+        <w:rPr>
+          <w:rtl/>
+        </w:rPr>
+      </w:pPr>
+      <w:r>
+        <w:rPr>
+          <w:rFonts w:hint="cs"/>
+          <w:rtl/>
+        </w:rPr>
+        <w:t xml:space="preserve">ערוצי בייג'ינג חיים במרחבים פיזיקליים מאוד שונים, לדוגמה, </w:t>
+      </w:r>
+      <w:r>
+        <w:t>CO</w:t>
+      </w:r>
+      <w:r>
+        <w:rPr>
+          <w:rFonts w:hint="cs"/>
+          <w:rtl/>
+        </w:rPr>
+        <w:t xml:space="preserve"> מול </w:t>
+      </w:r>
+      <w:r>
+        <w:t>O3</w:t>
+      </w:r>
+      <w:r>
+        <w:rPr>
+          <w:rFonts w:hint="cs"/>
+          <w:rtl/>
+        </w:rPr>
+        <w:t xml:space="preserve"> מול </w:t>
+      </w:r>
+      <w:r>
+        <w:t>PM2.5</w:t>
+      </w:r>
+      <w:r>
+        <w:rPr>
+          <w:rFonts w:hint="cs"/>
+          <w:rtl/>
+        </w:rPr>
+        <w:t xml:space="preserve">. </w:t>
+      </w:r>
+      <w:r>
+        <w:t>WP2</w:t>
+      </w:r>
+      <w:r>
+        <w:rPr>
+          <w:rFonts w:hint="cs"/>
+          <w:rtl/>
+        </w:rPr>
+        <w:t xml:space="preserve"> מתאים, לכל פיצ'ר </w:t>
+      </w:r>
+      <m:oMath>
+        <m:r>
+          <w:rPr>
+            <w:rFonts w:ascii="Cambria Math" w:hAnsi="Cambria Math"/>
+          </w:rPr>
+          <m:t>f</m:t>
+        </m:r>
+      </m:oMath>
+      <w:r>
+        <w:rPr>
+          <w:rFonts w:hint="cs"/>
+          <w:rtl/>
+        </w:rPr>
+        <w:t>:</w:t>
+      </w:r>
+    </w:p>
+    <w:p>
+      <w:pPr>
+        <w:rPr>
+          <w:rtl/>
+        </w:rPr>
+      </w:pPr>
+      <m:oMathPara>
+        <m:oMath>
+          <m:sSub>
+            <m:sSubPr>
+              <m:ctrlPr>
+                <w:rPr>
+                  <w:rFonts w:ascii="Cambria Math" w:hAnsi="Cambria Math"/>
+                  <w:i/>
+                </w:rPr>
+              </m:ctrlPr>
+            </m:sSubPr>
+            <m:e>
+              <m:r>
+                <w:rPr>
+                  <w:rFonts w:ascii="Cambria Math" w:hAnsi="Cambria Math"/>
+                </w:rPr>
+                <m:t>μ</m:t>
+              </m:r>
+            </m:e>
+            <m:sub>
+              <m:r>
+                <w:rPr>
+                  <w:rFonts w:ascii="Cambria Math" w:hAnsi="Cambria Math"/>
+                </w:rPr>
+                <m:t>f</m:t>
+              </m:r>
+            </m:sub>
+          </m:sSub>
+          <m:r>
+            <w:rPr>
+              <w:rFonts w:ascii="Cambria Math" w:hAnsi="Cambria Math"/>
+            </w:rPr>
+            <m:t>=E</m:t>
+          </m:r>
+          <m:d>
+            <m:dPr>
+              <m:begChr m:val="["/>
+              <m:endChr m:val="]"/>
+              <m:ctrlPr>
+                <w:rPr>
+                  <w:rFonts w:ascii="Cambria Math" w:hAnsi="Cambria Math"/>
+                  <w:i/>
+                </w:rPr>
+              </m:ctrlPr>
+            </m:dPr>
+            <m:e>
+              <m:sSub>
+                <m:sSubPr>
+                  <m:ctrlPr>
+                    <w:rPr>
+                      <w:rFonts w:ascii="Cambria Math" w:hAnsi="Cambria Math"/>
+                      <w:i/>
+                    </w:rPr>
+                  </m:ctrlPr>
+                </m:sSubPr>
+                <m:e>
+                  <m:r>
+                    <w:rPr>
+                      <w:rFonts w:ascii="Cambria Math" w:hAnsi="Cambria Math"/>
+                    </w:rPr>
+                    <m:t>x</m:t>
+                  </m:r>
+                </m:e>
+                <m:sub>
+                  <m:r>
+                    <w:rPr>
+                      <w:rFonts w:ascii="Cambria Math" w:hAnsi="Cambria Math"/>
+                    </w:rPr>
+                    <m:t>f</m:t>
+                  </m:r>
+                </m:sub>
+              </m:sSub>
+            </m:e>
+            <m:e>
+              <m:sSub>
+                <m:sSubPr>
+                  <m:ctrlPr>
+                    <w:rPr>
+                      <w:rFonts w:ascii="Cambria Math" w:hAnsi="Cambria Math"/>
+                      <w:i/>
+                    </w:rPr>
+                  </m:ctrlPr>
+                </m:sSubPr>
+                <m:e>
+                  <m:r>
+                    <w:rPr>
+                      <w:rFonts w:ascii="Cambria Math" w:hAnsi="Cambria Math"/>
+                    </w:rPr>
+                    <m:t>m</m:t>
+                  </m:r>
+                </m:e>
+                <m:sub>
+                  <m:r>
+                    <w:rPr>
+                      <w:rFonts w:ascii="Cambria Math" w:hAnsi="Cambria Math"/>
+                    </w:rPr>
+                    <m:t>f</m:t>
+                  </m:r>
+                </m:sub>
+              </m:sSub>
+              <m:r>
+                <w:rPr>
+                  <w:rFonts w:ascii="Cambria Math" w:hAnsi="Cambria Math"/>
+                </w:rPr>
+                <m:t>=1</m:t>
+              </m:r>
+            </m:e>
+          </m:d>
+          <m:r>
+            <w:rPr>
+              <w:rFonts w:ascii="Cambria Math" w:hAnsi="Cambria Math"/>
+            </w:rPr>
+            <m:t xml:space="preserve">,  </m:t>
+          </m:r>
+          <m:sSub>
+            <m:sSubPr>
+              <m:ctrlPr>
+                <w:rPr>
+                  <w:rFonts w:ascii="Cambria Math" w:hAnsi="Cambria Math"/>
+                  <w:i/>
+                </w:rPr>
+              </m:ctrlPr>
+            </m:sSubPr>
+            <m:e>
+              <m:r>
+                <w:rPr>
+                  <w:rFonts w:ascii="Cambria Math" w:hAnsi="Cambria Math"/>
+                </w:rPr>
+                <m:t>σ</m:t>
+              </m:r>
+            </m:e>
+            <m:sub>
+              <m:r>
+                <w:rPr>
+                  <w:rFonts w:ascii="Cambria Math" w:hAnsi="Cambria Math"/>
+                </w:rPr>
+                <m:t>f</m:t>
+              </m:r>
+            </m:sub>
+          </m:sSub>
+          <m:r>
+            <w:rPr>
+              <w:rFonts w:ascii="Cambria Math" w:hAnsi="Cambria Math"/>
+            </w:rPr>
+            <m:t>=std</m:t>
+          </m:r>
+          <m:d>
+            <m:dPr>
+              <m:ctrlPr>
+                <w:rPr>
+                  <w:rFonts w:ascii="Cambria Math" w:hAnsi="Cambria Math"/>
+                  <w:i/>
+                </w:rPr>
+              </m:ctrlPr>
+            </m:dPr>
+            <m:e>
+              <m:sSub>
+                <m:sSubPr>
+                  <m:ctrlPr>
+                    <w:rPr>
+                      <w:rFonts w:ascii="Cambria Math" w:hAnsi="Cambria Math"/>
+                      <w:i/>
+                    </w:rPr>
+                  </m:ctrlPr>
+                </m:sSubPr>
+                <m:e>
+                  <m:r>
+                    <w:rPr>
+                      <w:rFonts w:ascii="Cambria Math" w:hAnsi="Cambria Math"/>
+                    </w:rPr>
+                    <m:t>x</m:t>
+                  </m:r>
+                </m:e>
+                <m:sub>
+                  <m:r>
+                    <w:rPr>
+                      <w:rFonts w:ascii="Cambria Math" w:hAnsi="Cambria Math"/>
+                    </w:rPr>
+                    <m:t>f</m:t>
+                  </m:r>
+                </m:sub>
+              </m:sSub>
+            </m:e>
+            <m:e>
+              <m:sSub>
+                <m:sSubPr>
+                  <m:ctrlPr>
+                    <w:rPr>
+                      <w:rFonts w:ascii="Cambria Math" w:hAnsi="Cambria Math"/>
+                      <w:i/>
+                    </w:rPr>
+                  </m:ctrlPr>
+                </m:sSubPr>
+                <m:e>
+                  <m:r>
+                    <w:rPr>
+                      <w:rFonts w:ascii="Cambria Math" w:hAnsi="Cambria Math"/>
+                    </w:rPr>
+                    <m:t>m</m:t>
+                  </m:r>
+                </m:e>
+                <m:sub>
+                  <m:r>
+                    <w:rPr>
+                      <w:rFonts w:ascii="Cambria Math" w:hAnsi="Cambria Math"/>
+                    </w:rPr>
+                    <m:t>f</m:t>
+                  </m:r>
+                </m:sub>
+              </m:sSub>
+              <m:r>
+                <w:rPr>
+                  <w:rFonts w:ascii="Cambria Math" w:hAnsi="Cambria Math"/>
+                </w:rPr>
+                <m:t>=1</m:t>
+              </m:r>
+            </m:e>
+          </m:d>
+        </m:oMath>
+      </m:oMathPara>
+    </w:p>
+    <w:p>
+      <w:pPr>
+        <w:rPr>
+          <w:rtl/>
+        </w:rPr>
+      </w:pPr>
+      <w:r>
+        <w:rPr>
+          <w:rFonts w:hint="cs"/>
+          <w:rtl/>
+        </w:rPr>
+        <w:t xml:space="preserve">על </w:t>
+      </w:r>
+      <w:r>
+        <w:rPr>
+          <w:rFonts w:hint="cs"/>
+          <w:b/>
+          <w:bCs/>
+          <w:rtl/>
+        </w:rPr>
+        <w:t>תאי אימון נצפים בלבד</w:t>
+      </w:r>
+      <w:r>
+        <w:rPr>
+          <w:rFonts w:hint="cs"/>
+          <w:rtl/>
+        </w:rPr>
+        <w:t>, ואז מעתיקה:</w:t>
+      </w:r>
+    </w:p>
+    <w:p>
+      <w:pPr>
+        <w:rPr>
+          <w:rtl/>
+        </w:rPr>
+      </w:pPr>
+      <m:oMathPara>
+        <m:oMath>
+          <m:sSub>
+            <m:sSubPr>
+              <m:ctrlPr>
+                <w:rPr>
+                  <w:rFonts w:ascii="Cambria Math" w:hAnsi="Cambria Math"/>
+                  <w:i/>
+                </w:rPr>
+              </m:ctrlPr>
+            </m:sSubPr>
+            <m:e>
+              <m:acc>
+                <m:accPr>
+                  <m:chr m:val="̃"/>
+                  <m:ctrlPr>
+                    <w:rPr>
+                      <w:rFonts w:ascii="Cambria Math" w:hAnsi="Cambria Math"/>
+                      <w:i/>
+                    </w:rPr>
+                  </m:ctrlPr>
+                </m:accPr>
+                <m:e>
+                  <m:r>
+                    <w:rPr>
+                      <w:rFonts w:ascii="Cambria Math" w:hAnsi="Cambria Math"/>
+                    </w:rPr>
+                    <m:t>x</m:t>
+                  </m:r>
+                </m:e>
+              </m:acc>
+            </m:e>
+            <m:sub>
+              <m:r>
+                <w:rPr>
+                  <w:rFonts w:ascii="Cambria Math" w:hAnsi="Cambria Math"/>
+                </w:rPr>
+                <m:t>f</m:t>
+              </m:r>
+            </m:sub>
+          </m:sSub>
+          <m:r>
+            <w:rPr>
+              <w:rFonts w:ascii="Cambria Math" w:hAnsi="Cambria Math"/>
+            </w:rPr>
+            <m:t>=</m:t>
+          </m:r>
+          <m:f>
+            <m:fPr>
+              <m:ctrlPr>
+                <w:rPr>
+                  <w:rFonts w:ascii="Cambria Math" w:hAnsi="Cambria Math"/>
+                  <w:i/>
+                </w:rPr>
+              </m:ctrlPr>
+            </m:fPr>
+            <m:num>
+              <m:sSub>
+                <m:sSubPr>
+                  <m:ctrlPr>
+                    <w:rPr>
+                      <w:rFonts w:ascii="Cambria Math" w:hAnsi="Cambria Math"/>
+                      <w:i/>
+                    </w:rPr>
+                  </m:ctrlPr>
+                </m:sSubPr>
+                <m:e>
+                  <m:r>
+                    <w:rPr>
+                      <w:rFonts w:ascii="Cambria Math" w:hAnsi="Cambria Math"/>
+                    </w:rPr>
+                    <m:t>x</m:t>
+                  </m:r>
+                </m:e>
+                <m:sub>
+                  <m:r>
+                    <w:rPr>
+                      <w:rFonts w:ascii="Cambria Math" w:hAnsi="Cambria Math"/>
+                    </w:rPr>
+                    <m:t>f</m:t>
+                  </m:r>
+                </m:sub>
+              </m:sSub>
+              <m:r>
+                <w:rPr>
+                  <w:rFonts w:ascii="Cambria Math" w:hAnsi="Cambria Math"/>
+                </w:rPr>
+                <m:t>-</m:t>
+              </m:r>
+              <m:sSub>
+                <m:sSubPr>
+                  <m:ctrlPr>
+                    <w:rPr>
+                      <w:rFonts w:ascii="Cambria Math" w:hAnsi="Cambria Math"/>
+                      <w:i/>
+                    </w:rPr>
+                  </m:ctrlPr>
+                </m:sSubPr>
+                <m:e>
+                  <m:r>
+                    <w:rPr>
+                      <w:rFonts w:ascii="Cambria Math" w:hAnsi="Cambria Math"/>
+                    </w:rPr>
+                    <m:t>μ</m:t>
+                  </m:r>
+                </m:e>
+                <m:sub>
+                  <m:r>
+                    <w:rPr>
+                      <w:rFonts w:ascii="Cambria Math" w:hAnsi="Cambria Math"/>
+                    </w:rPr>
+                    <m:t>f</m:t>
+                  </m:r>
+                </m:sub>
+              </m:sSub>
+              <m:ctrlPr>
+                <w:rPr>
+                  <w:rFonts w:ascii="Cambria Math" w:hAnsi="Cambria Math"/>
+                  <w:i/>
+                  <w:rtl/>
+                </w:rPr>
+              </m:ctrlPr>
+            </m:num>
+            <m:den>
+              <m:sSub>
+                <m:sSubPr>
+                  <m:ctrlPr>
+                    <w:rPr>
+                      <w:rFonts w:ascii="Cambria Math" w:hAnsi="Cambria Math"/>
+                      <w:i/>
+                    </w:rPr>
+                  </m:ctrlPr>
+                </m:sSubPr>
+                <m:e>
+                  <m:r>
+                    <w:rPr>
+                      <w:rFonts w:ascii="Cambria Math" w:hAnsi="Cambria Math"/>
+                    </w:rPr>
+                    <m:t>σ</m:t>
+                  </m:r>
+                </m:e>
+                <m:sub>
+                  <m:r>
+                    <w:rPr>
+                      <w:rFonts w:ascii="Cambria Math" w:hAnsi="Cambria Math"/>
+                    </w:rPr>
+                    <m:t>f</m:t>
+                  </m:r>
+                </m:sub>
+              </m:sSub>
+            </m:den>
+          </m:f>
+        </m:oMath>
+      </m:oMathPara>
+    </w:p>
+    <w:p>
+      <w:pPr>
+        <w:rPr>
+          <w:rtl/>
+        </w:rPr>
+      </w:pPr>
+      <w:r>
+        <w:rPr>
+          <w:rFonts w:hint="cs"/>
+          <w:rtl/>
+        </w:rPr>
+        <w:t xml:space="preserve">רק כאשר </w:t>
+      </w:r>
+      <m:oMath>
+        <m:r>
+          <w:rPr>
+            <w:rFonts w:ascii="Cambria Math" w:hAnsi="Cambria Math"/>
+          </w:rPr>
+          <m:t>m=1</m:t>
+        </m:r>
+      </m:oMath>
+      <w:r>
+        <w:rPr>
+          <w:rFonts w:hint="cs"/>
+          <w:rtl/>
+        </w:rPr>
+        <w:t xml:space="preserve">. חסר נשאר </w:t>
+      </w:r>
+      <m:oMath>
+        <m:r>
+          <w:rPr>
+            <w:rFonts w:ascii="Cambria Math" w:hAnsi="Cambria Math"/>
+          </w:rPr>
+          <m:t>0</m:t>
+        </m:r>
+      </m:oMath>
+      <w:r>
+        <w:rPr>
+          <w:rFonts w:hint="cs"/>
+          <w:rtl/>
+        </w:rPr>
+        <w:t xml:space="preserve">. לולא זה, רעש ה </w:t>
+      </w:r>
+      <w:r>
+        <w:t>VP-SDE</w:t>
+      </w:r>
+      <w:r>
+        <w:rPr>
+          <w:rFonts w:hint="cs"/>
+          <w:rtl/>
+        </w:rPr>
+        <w:t xml:space="preserve"> ואובדן ה </w:t>
+      </w:r>
+      <w:r>
+        <w:t>DSM</w:t>
+      </w:r>
+      <w:r>
+        <w:rPr>
+          <w:rFonts w:hint="cs"/>
+          <w:rtl/>
+        </w:rPr>
+        <w:t xml:space="preserve"> נשלטים על פיצ'רים מסקאלות גבוהות. אנו מבקשים מהניקוד </w:t>
+      </w:r>
+      <m:oMath>
+        <m:sSub>
+          <m:sSubPr>
+            <m:ctrlPr>
+              <w:rPr>
+                <w:rFonts w:ascii="Cambria Math" w:hAnsi="Cambria Math"/>
+                <w:i/>
+              </w:rPr>
+            </m:ctrlPr>
+          </m:sSubPr>
+          <m:e>
+            <m:r>
+              <w:rPr>
+                <w:rFonts w:ascii="Cambria Math" w:hAnsi="Cambria Math"/>
+              </w:rPr>
+              <m:t>s</m:t>
+            </m:r>
+          </m:e>
+          <m:sub>
+            <m:r>
+              <w:rPr>
+                <w:rFonts w:ascii="Cambria Math" w:hAnsi="Cambria Math"/>
+              </w:rPr>
+              <m:t>θ</m:t>
+            </m:r>
+          </m:sub>
+        </m:sSub>
+        <m:d>
+          <m:dPr>
+            <m:ctrlPr>
+              <w:rPr>
+                <w:rFonts w:ascii="Cambria Math" w:hAnsi="Cambria Math"/>
+                <w:i/>
+              </w:rPr>
+            </m:ctrlPr>
+          </m:dPr>
+          <m:e>
+            <m:sSub>
+              <m:sSubPr>
+                <m:ctrlPr>
+                  <w:rPr>
+                    <w:rFonts w:ascii="Cambria Math" w:hAnsi="Cambria Math"/>
+                    <w:i/>
+                  </w:rPr>
+                </m:ctrlPr>
+              </m:sSubPr>
+              <m:e>
+                <m:acc>
+                  <m:accPr>
+                    <m:chr m:val="̃"/>
+                    <m:ctrlPr>
+                      <w:rPr>
+                        <w:rFonts w:ascii="Cambria Math" w:hAnsi="Cambria Math"/>
+                        <w:i/>
+                      </w:rPr>
+                    </m:ctrlPr>
+                  </m:accPr>
+                  <m:e>
+                    <m:r>
+                      <w:rPr>
+                        <w:rFonts w:ascii="Cambria Math" w:hAnsi="Cambria Math"/>
+                      </w:rPr>
+                      <m:t>y</m:t>
+                    </m:r>
+                  </m:e>
+                </m:acc>
+              </m:e>
+              <m:sub>
+                <m:r>
+                  <w:rPr>
+                    <w:rFonts w:ascii="Cambria Math" w:hAnsi="Cambria Math"/>
+                  </w:rPr>
+                  <m:t>t</m:t>
+                </m:r>
+              </m:sub>
+            </m:sSub>
+            <m:r>
+              <w:rPr>
+                <w:rFonts w:ascii="Cambria Math" w:hAnsi="Cambria Math"/>
+              </w:rPr>
+              <m:t>,t,…</m:t>
+            </m:r>
+          </m:e>
+        </m:d>
+      </m:oMath>
+      <w:r>
+        <w:rPr>
+          <w:rFonts w:hint="cs"/>
+          <w:rtl/>
+        </w:rPr>
+        <w:t xml:space="preserve"> </w:t>
+      </w:r>
+      <w:r>
+        <w:rPr>
+          <w:rFonts w:hint="cs"/>
+          <w:rtl/>
+        </w:rPr>
+        <w:lastRenderedPageBreak/>
+        <w:t xml:space="preserve">שיבצע </w:t>
+      </w:r>
+      <w:r>
+        <w:t>denoise</w:t>
+      </w:r>
+      <w:r>
+        <w:rPr>
+          <w:rFonts w:hint="cs"/>
+          <w:rtl/>
+        </w:rPr>
+        <w:t xml:space="preserve"> עבור ערבוב של שונויות שאינן מותאמות, שהופכות את הגרדיאנטים ללא מאוזנים, ולאימון להיות שביר.</w:t>
+      </w:r>
+    </w:p>
+    <w:p>
+      <w:pPr>
+        <w:rPr>
+          <w:rtl/>
+        </w:rPr>
+      </w:pPr>
+      <w:r>
+        <w:rPr>
+          <w:rFonts w:hint="cs"/>
+          <w:rtl/>
+        </w:rPr>
+        <w:t xml:space="preserve">ה </w:t>
+      </w:r>
+      <w:r>
+        <w:t>VP-SDE</w:t>
+      </w:r>
+      <w:r>
+        <w:rPr>
+          <w:rFonts w:hint="cs"/>
+          <w:rtl/>
+        </w:rPr>
+        <w:t xml:space="preserve"> נבנה כך שכאשר </w:t>
+      </w:r>
+      <m:oMath>
+        <m:r>
+          <w:rPr>
+            <w:rFonts w:ascii="Cambria Math" w:hAnsi="Cambria Math"/>
+          </w:rPr>
+          <m:t>t→</m:t>
+        </m:r>
+        <m:sSub>
+          <m:sSubPr>
+            <m:ctrlPr>
+              <w:rPr>
+                <w:rFonts w:ascii="Cambria Math" w:hAnsi="Cambria Math"/>
+                <w:i/>
+              </w:rPr>
+            </m:ctrlPr>
+          </m:sSubPr>
+          <m:e>
+            <m:r>
+              <w:rPr>
+                <w:rFonts w:ascii="Cambria Math" w:hAnsi="Cambria Math"/>
+              </w:rPr>
+              <m:t>T</m:t>
+            </m:r>
+          </m:e>
+          <m:sub>
+            <m:r>
+              <m:rPr>
+                <m:nor/>
+              </m:rPr>
+              <w:rPr>
+                <w:rFonts w:ascii="Cambria Math" w:hAnsi="Cambria Math"/>
+              </w:rPr>
+              <m:t>diff</m:t>
+            </m:r>
+          </m:sub>
+        </m:sSub>
+      </m:oMath>
+      <w:r>
+        <w:rPr>
+          <w:rFonts w:hint="cs"/>
+          <w:rtl/>
+        </w:rPr>
+        <w:t xml:space="preserve">, המרגינל מתקרב ל </w:t>
+      </w:r>
+      <m:oMath>
+        <m:r>
+          <m:rPr>
+            <m:scr m:val="script"/>
+          </m:rPr>
+          <w:rPr>
+            <w:rFonts w:ascii="Cambria Math" w:hAnsi="Cambria Math"/>
+          </w:rPr>
+          <m:t>N</m:t>
+        </m:r>
+        <m:d>
+          <m:dPr>
+            <m:ctrlPr>
+              <w:rPr>
+                <w:rFonts w:ascii="Cambria Math" w:hAnsi="Cambria Math"/>
+                <w:i/>
+              </w:rPr>
+            </m:ctrlPr>
+          </m:dPr>
+          <m:e>
+            <m:r>
+              <w:rPr>
+                <w:rFonts w:ascii="Cambria Math" w:hAnsi="Cambria Math"/>
+              </w:rPr>
+              <m:t>0,I</m:t>
+            </m:r>
+          </m:e>
+        </m:d>
+      </m:oMath>
+      <w:r>
+        <w:rPr>
+          <w:rFonts w:hint="cs"/>
+          <w:rtl/>
+        </w:rPr>
+        <w:t xml:space="preserve"> </w:t>
+      </w:r>
+      <w:r>
+        <w:rPr>
+          <w:rFonts w:hint="cs"/>
+          <w:b/>
+          <w:bCs/>
+          <w:rtl/>
+        </w:rPr>
+        <w:t>במרחב שהמודל רואה</w:t>
+      </w:r>
+      <w:r>
+        <w:rPr>
+          <w:rFonts w:hint="cs"/>
+          <w:rtl/>
+        </w:rPr>
+        <w:t>. הנחה זו היא הרבה יותר בריאה מאשר הסטנדרטיזציה פר-פיצ'ר:</w:t>
+      </w:r>
+    </w:p>
+    <w:p>
+      <w:pPr>
+        <w:pStyle w:val="ListParagraph"/>
+        <w:numPr>
+          <w:ilvl w:val="0"/>
+          <w:numId w:val="1"/>
+        </w:numPr>
+      </w:pPr>
+      <w:r>
+        <w:rPr>
+          <w:rFonts w:hint="cs"/>
+          <w:rtl/>
+        </w:rPr>
+        <w:t xml:space="preserve">קדמי: </w:t>
+      </w:r>
+      <m:oMath>
+        <m:sSub>
+          <m:sSubPr>
+            <m:ctrlPr>
+              <w:rPr>
+                <w:rFonts w:ascii="Cambria Math" w:hAnsi="Cambria Math"/>
+                <w:i/>
+              </w:rPr>
+            </m:ctrlPr>
+          </m:sSubPr>
+          <m:e>
+            <m:acc>
+              <m:accPr>
+                <m:chr m:val="̃"/>
+                <m:ctrlPr>
+                  <w:rPr>
+                    <w:rFonts w:ascii="Cambria Math" w:hAnsi="Cambria Math"/>
+                    <w:i/>
+                  </w:rPr>
+                </m:ctrlPr>
+              </m:accPr>
+              <m:e>
+                <m:r>
+                  <w:rPr>
+                    <w:rFonts w:ascii="Cambria Math" w:hAnsi="Cambria Math"/>
+                  </w:rPr>
+                  <m:t>x</m:t>
+                </m:r>
+              </m:e>
+            </m:acc>
+          </m:e>
+          <m:sub>
+            <m:r>
+              <w:rPr>
+                <w:rFonts w:ascii="Cambria Math" w:hAnsi="Cambria Math"/>
+              </w:rPr>
+              <m:t>t</m:t>
+            </m:r>
+          </m:sub>
+        </m:sSub>
+        <m:r>
+          <w:rPr>
+            <w:rFonts w:ascii="Cambria Math" w:hAnsi="Cambria Math"/>
+          </w:rPr>
+          <m:t>=α</m:t>
+        </m:r>
+        <m:d>
+          <m:dPr>
+            <m:ctrlPr>
+              <w:rPr>
+                <w:rFonts w:ascii="Cambria Math" w:hAnsi="Cambria Math"/>
+                <w:i/>
+              </w:rPr>
+            </m:ctrlPr>
+          </m:dPr>
+          <m:e>
+            <m:r>
+              <w:rPr>
+                <w:rFonts w:ascii="Cambria Math" w:hAnsi="Cambria Math"/>
+              </w:rPr>
+              <m:t>t</m:t>
+            </m:r>
+          </m:e>
+        </m:d>
+        <m:sSub>
+          <m:sSubPr>
+            <m:ctrlPr>
+              <w:rPr>
+                <w:rFonts w:ascii="Cambria Math" w:hAnsi="Cambria Math"/>
+                <w:i/>
+              </w:rPr>
+            </m:ctrlPr>
+          </m:sSubPr>
+          <m:e>
+            <m:acc>
+              <m:accPr>
+                <m:chr m:val="̃"/>
+                <m:ctrlPr>
+                  <w:rPr>
+                    <w:rFonts w:ascii="Cambria Math" w:hAnsi="Cambria Math"/>
+                    <w:i/>
+                  </w:rPr>
+                </m:ctrlPr>
+              </m:accPr>
+              <m:e>
+                <m:r>
+                  <w:rPr>
+                    <w:rFonts w:ascii="Cambria Math" w:hAnsi="Cambria Math"/>
+                  </w:rPr>
+                  <m:t>x</m:t>
+                </m:r>
+              </m:e>
+            </m:acc>
+          </m:e>
+          <m:sub>
+            <m:r>
+              <w:rPr>
+                <w:rFonts w:ascii="Cambria Math" w:hAnsi="Cambria Math"/>
+              </w:rPr>
+              <m:t>0</m:t>
+            </m:r>
+          </m:sub>
+        </m:sSub>
+        <m:r>
+          <w:rPr>
+            <w:rFonts w:ascii="Cambria Math" w:hAnsi="Cambria Math"/>
+          </w:rPr>
+          <m:t>+σ</m:t>
+        </m:r>
+        <m:d>
+          <m:dPr>
+            <m:ctrlPr>
+              <w:rPr>
+                <w:rFonts w:ascii="Cambria Math" w:hAnsi="Cambria Math"/>
+                <w:i/>
+              </w:rPr>
+            </m:ctrlPr>
+          </m:dPr>
+          <m:e>
+            <m:r>
+              <w:rPr>
+                <w:rFonts w:ascii="Cambria Math" w:hAnsi="Cambria Math"/>
+              </w:rPr>
+              <m:t>t</m:t>
+            </m:r>
+          </m:e>
+        </m:d>
+        <m:r>
+          <w:rPr>
+            <w:rFonts w:ascii="Cambria Math" w:hAnsi="Cambria Math"/>
+          </w:rPr>
+          <m:t>ϵ</m:t>
+        </m:r>
+      </m:oMath>
+      <w:r>
+        <w:rPr>
+          <w:rFonts w:hint="cs"/>
+          <w:rtl/>
+        </w:rPr>
+        <w:t>.</w:t>
+      </w:r>
+    </w:p>
+    <w:p>
+      <w:pPr>
+        <w:pStyle w:val="ListParagraph"/>
+        <w:numPr>
+          <w:ilvl w:val="0"/>
+          <w:numId w:val="1"/>
+        </w:numPr>
+      </w:pPr>
+      <w:r>
+        <w:t>DSM</w:t>
+      </w:r>
+      <w:r>
+        <w:rPr>
+          <w:rFonts w:hint="cs"/>
+          <w:rtl/>
+        </w:rPr>
+        <w:t xml:space="preserve"> נוגע לתוצאות מסדר </w:t>
+      </w:r>
+      <m:oMath>
+        <m:f>
+          <m:fPr>
+            <m:ctrlPr>
+              <w:rPr>
+                <w:rFonts w:ascii="Cambria Math" w:hAnsi="Cambria Math"/>
+                <w:i/>
+              </w:rPr>
+            </m:ctrlPr>
+          </m:fPr>
+          <m:num>
+            <m:r>
+              <w:rPr>
+                <w:rFonts w:ascii="Cambria Math" w:hAnsi="Cambria Math"/>
+              </w:rPr>
+              <m:t>-ϵ</m:t>
+            </m:r>
+          </m:num>
+          <m:den>
+            <m:r>
+              <w:rPr>
+                <w:rFonts w:ascii="Cambria Math" w:hAnsi="Cambria Math"/>
+              </w:rPr>
+              <m:t>σ</m:t>
+            </m:r>
+            <m:d>
+              <m:dPr>
+                <m:ctrlPr>
+                  <w:rPr>
+                    <w:rFonts w:ascii="Cambria Math" w:hAnsi="Cambria Math"/>
+                    <w:i/>
+                  </w:rPr>
+                </m:ctrlPr>
+              </m:dPr>
+              <m:e>
+                <m:r>
+                  <w:rPr>
+                    <w:rFonts w:ascii="Cambria Math" w:hAnsi="Cambria Math"/>
+                  </w:rPr>
+                  <m:t>t</m:t>
+                </m:r>
+              </m:e>
+            </m:d>
+          </m:den>
+        </m:f>
+      </m:oMath>
+      <w:r>
+        <w:rPr>
+          <w:rFonts w:hint="cs"/>
+          <w:rtl/>
+        </w:rPr>
+        <w:t xml:space="preserve">, בערך </w:t>
+      </w:r>
+      <m:oMath>
+        <m:r>
+          <w:rPr>
+            <w:rFonts w:ascii="Cambria Math" w:hAnsi="Cambria Math"/>
+          </w:rPr>
+          <m:t>O</m:t>
+        </m:r>
+        <m:d>
+          <m:dPr>
+            <m:ctrlPr>
+              <w:rPr>
+                <w:rFonts w:ascii="Cambria Math" w:hAnsi="Cambria Math"/>
+                <w:i/>
+              </w:rPr>
+            </m:ctrlPr>
+          </m:dPr>
+          <m:e>
+            <m:r>
+              <w:rPr>
+                <w:rFonts w:ascii="Cambria Math" w:hAnsi="Cambria Math"/>
+              </w:rPr>
+              <m:t>1</m:t>
+            </m:r>
+          </m:e>
+        </m:d>
+      </m:oMath>
+      <w:r>
+        <w:rPr>
+          <w:rFonts w:hint="cs"/>
+          <w:rtl/>
+        </w:rPr>
+        <w:t xml:space="preserve"> אם </w:t>
+      </w:r>
+      <m:oMath>
+        <m:sSub>
+          <m:sSubPr>
+            <m:ctrlPr>
+              <w:rPr>
+                <w:rFonts w:ascii="Cambria Math" w:hAnsi="Cambria Math"/>
+                <w:i/>
+              </w:rPr>
+            </m:ctrlPr>
+          </m:sSubPr>
+          <m:e>
+            <m:acc>
+              <m:accPr>
+                <m:chr m:val="̃"/>
+                <m:ctrlPr>
+                  <w:rPr>
+                    <w:rFonts w:ascii="Cambria Math" w:hAnsi="Cambria Math"/>
+                    <w:i/>
+                  </w:rPr>
+                </m:ctrlPr>
+              </m:accPr>
+              <m:e>
+                <m:r>
+                  <w:rPr>
+                    <w:rFonts w:ascii="Cambria Math" w:hAnsi="Cambria Math"/>
+                  </w:rPr>
+                  <m:t>x</m:t>
+                </m:r>
+              </m:e>
+            </m:acc>
+          </m:e>
+          <m:sub>
+            <m:r>
+              <w:rPr>
+                <w:rFonts w:ascii="Cambria Math" w:hAnsi="Cambria Math"/>
+              </w:rPr>
+              <m:t>0</m:t>
+            </m:r>
+          </m:sub>
+        </m:sSub>
+      </m:oMath>
+      <w:r>
+        <w:rPr>
+          <w:rFonts w:hint="cs"/>
+          <w:rtl/>
+        </w:rPr>
+        <w:t xml:space="preserve"> הוא </w:t>
+      </w:r>
+      <m:oMath>
+        <m:r>
+          <w:rPr>
+            <w:rFonts w:ascii="Cambria Math" w:hAnsi="Cambria Math"/>
+          </w:rPr>
+          <m:t>O</m:t>
+        </m:r>
+        <m:d>
+          <m:dPr>
+            <m:ctrlPr>
+              <w:rPr>
+                <w:rFonts w:ascii="Cambria Math" w:hAnsi="Cambria Math"/>
+                <w:i/>
+              </w:rPr>
+            </m:ctrlPr>
+          </m:dPr>
+          <m:e>
+            <m:r>
+              <w:rPr>
+                <w:rFonts w:ascii="Cambria Math" w:hAnsi="Cambria Math"/>
+              </w:rPr>
+              <m:t>1</m:t>
+            </m:r>
+          </m:e>
+        </m:d>
+      </m:oMath>
+      <w:r>
+        <w:rPr>
+          <w:rFonts w:hint="cs"/>
+          <w:rtl/>
+        </w:rPr>
+        <w:t>.</w:t>
+      </w:r>
+    </w:p>
+    <w:p>
+      <w:pPr>
+        <w:rPr>
+          <w:rFonts w:hint="cs"/>
+          <w:rtl/>
+        </w:rPr>
+      </w:pPr>
+      <w:r>
+        <w:rPr>
+          <w:rFonts w:hint="cs"/>
+          <w:rtl/>
+        </w:rPr>
+        <w:t>[להשלים]</w:t>
       </w:r>
     </w:p>
     <w:sectPr>

</xml_diff>

<commit_message>
Add Milestone 4 Streamlit product path.
</commit_message>
<xml_diff>
--- a/docs/דוח התקדמות.docx
+++ b/docs/דוח התקדמות.docx
@@ -6,7 +6,6 @@
       <w:pPr>
         <w:jc w:val="center"/>
         <w:rPr>
-          <w:rFonts w:hint="cs"/>
           <w:sz w:val="36"/>
           <w:szCs w:val="36"/>
           <w:rtl/>
@@ -2547,61 +2546,6 @@
     </w:p>
     <w:p>
       <w:pPr>
-        <w:tabs>
-          <w:tab w:val="left" w:pos="2107"/>
-        </w:tabs>
-        <w:rPr>
-          <w:i/>
-          <w:rtl/>
-        </w:rPr>
-      </w:pPr>
-    </w:p>
-    <w:p>
-      <w:pPr>
-        <w:tabs>
-          <w:tab w:val="left" w:pos="2107"/>
-        </w:tabs>
-        <w:rPr>
-          <w:i/>
-          <w:rtl/>
-        </w:rPr>
-      </w:pPr>
-    </w:p>
-    <w:p>
-      <w:pPr>
-        <w:tabs>
-          <w:tab w:val="left" w:pos="2107"/>
-        </w:tabs>
-        <w:rPr>
-          <w:i/>
-          <w:rtl/>
-        </w:rPr>
-      </w:pPr>
-    </w:p>
-    <w:p>
-      <w:pPr>
-        <w:tabs>
-          <w:tab w:val="left" w:pos="2107"/>
-        </w:tabs>
-        <w:rPr>
-          <w:i/>
-          <w:rtl/>
-        </w:rPr>
-      </w:pPr>
-    </w:p>
-    <w:p>
-      <w:pPr>
-        <w:tabs>
-          <w:tab w:val="left" w:pos="2107"/>
-        </w:tabs>
-        <w:rPr>
-          <w:i/>
-          <w:rtl/>
-        </w:rPr>
-      </w:pPr>
-    </w:p>
-    <w:p>
-      <w:pPr>
         <w:rPr>
           <w:rtl/>
         </w:rPr>
@@ -3087,7 +3031,6 @@
           <w:u w:val="single"/>
           <w:rtl/>
         </w:rPr>
-        <w:lastRenderedPageBreak/>
         <w:t>גנרטורים</w:t>
       </w:r>
       <w:r>
@@ -3278,7 +3221,15 @@
           <w:rFonts w:hint="cs"/>
           <w:rtl/>
         </w:rPr>
-        <w:t xml:space="preserve"> הם הערוצים (1-3). הגנרטורים קיימים בשביל שיהיה לנו אמת בסיסית ידועה לפני </w:t>
+        <w:t xml:space="preserve"> הם הערוצים (1-3). הגנרטורים קיימים בשביל שיהיה לנו </w:t>
+      </w:r>
+      <w:r>
+        <w:rPr>
+          <w:rFonts w:hint="cs"/>
+          <w:rtl/>
+        </w:rPr>
+        <w:lastRenderedPageBreak/>
+        <w:t xml:space="preserve">אמת בסיסית ידועה לפני </w:t>
       </w:r>
       <w:r>
         <w:t>masking</w:t>
@@ -4332,7 +4283,6 @@
           <w:i/>
           <w:noProof/>
         </w:rPr>
-        <w:lastRenderedPageBreak/>
         <w:drawing>
           <wp:inline distT="0" distB="0" distL="0" distR="0" wp14:anchorId="15045581" wp14:editId="3066A8D7">
             <wp:extent cx="5731510" cy="2005965"/>
@@ -4396,6 +4346,7 @@
           <w:i/>
           <w:rtl/>
         </w:rPr>
+        <w:lastRenderedPageBreak/>
         <w:t>הקו האפור (</w:t>
       </w:r>
       <w:r>
@@ -4518,14 +4469,6 @@
         </w:rPr>
         <w:t>) חייב לשחזר את האזורים עם נקודות אדומות מתוך הקונטקסט הכחול הנצפה, ולא מתוך הקו האפור.</w:t>
       </w:r>
-    </w:p>
-    <w:p>
-      <w:pPr>
-        <w:rPr>
-          <w:i/>
-          <w:rtl/>
-        </w:rPr>
-      </w:pPr>
     </w:p>
     <w:p>
       <w:pPr>
@@ -4671,7 +4614,6 @@
           <w:noProof/>
           <w:rtl/>
         </w:rPr>
-        <w:lastRenderedPageBreak/>
         <w:drawing>
           <wp:inline distT="0" distB="0" distL="0" distR="0" wp14:anchorId="7194AE13" wp14:editId="755CD3E6">
             <wp:extent cx="5731510" cy="2574925"/>
@@ -4747,6 +4689,7 @@
           <w:noProof/>
           <w:rtl/>
         </w:rPr>
+        <w:lastRenderedPageBreak/>
         <w:drawing>
           <wp:inline distT="0" distB="0" distL="0" distR="0" wp14:anchorId="1C3A5351" wp14:editId="211BF079">
             <wp:extent cx="5731510" cy="1519555"/>
@@ -5482,7 +5425,6 @@
           <w:i/>
           <w:rtl/>
         </w:rPr>
-        <w:lastRenderedPageBreak/>
         <w:t xml:space="preserve">אנחנו לא בוחרים קבוע אחד </w:t>
       </w:r>
       <m:oMath>
@@ -6186,6 +6128,7 @@
           <w:i/>
           <w:rtl/>
         </w:rPr>
+        <w:lastRenderedPageBreak/>
         <w:t xml:space="preserve">אנחנו לא צריכים לבצע סימולציה עבור מסלול המד"ס. עבור </w:t>
       </w:r>
       <w:r>
@@ -6983,16 +6926,7 @@
           <w:i/>
           <w:rtl/>
         </w:rPr>
-        <w:t xml:space="preserve">, יש לנו סינוס נקי (ההפרעות הקטנות נובעות מהרעש הגאוסיאני הקטן של הגנרטור, ולא המד"ס </w:t>
-      </w:r>
-      <w:r>
-        <w:rPr>
-          <w:rFonts w:hint="cs"/>
-          <w:i/>
-          <w:rtl/>
-        </w:rPr>
-        <w:lastRenderedPageBreak/>
-        <w:t xml:space="preserve">עצמו). כאשר </w:t>
+        <w:t xml:space="preserve">, יש לנו סינוס נקי (ההפרעות הקטנות נובעות מהרעש הגאוסיאני הקטן של הגנרטור, ולא המד"ס עצמו). כאשר </w:t>
       </w:r>
       <m:oMath>
         <m:r>
@@ -8448,7 +8382,6 @@
           <w:i/>
           <w:rtl/>
         </w:rPr>
-        <w:lastRenderedPageBreak/>
         <w:t xml:space="preserve">רשת ניקוד זו היא מה שהופכת אחר כך להיות </w:t>
       </w:r>
       <m:oMath>
@@ -10040,7 +9973,6 @@
           <w:i/>
           <w:rtl/>
         </w:rPr>
-        <w:lastRenderedPageBreak/>
         <w:t xml:space="preserve">בחבילה זו אנו משתמשים ב </w:t>
       </w:r>
       <w:r>
@@ -10181,6 +10113,7 @@
           <w:noProof/>
           <w:rtl/>
         </w:rPr>
+        <w:lastRenderedPageBreak/>
         <w:drawing>
           <wp:inline distT="0" distB="0" distL="0" distR="0" wp14:anchorId="7E0EFD77" wp14:editId="6DB14F16">
             <wp:extent cx="5896549" cy="2709172"/>
@@ -10555,7 +10488,6 @@
           <w:u w:val="single"/>
           <w:rtl/>
         </w:rPr>
-        <w:lastRenderedPageBreak/>
         <w:t xml:space="preserve">1. </w:t>
       </w:r>
       <w:r>
@@ -13220,7 +13152,6 @@
     <w:p>
       <w:pPr>
         <w:rPr>
-          <w:rFonts w:hint="cs"/>
           <w:rtl/>
         </w:rPr>
       </w:pPr>
@@ -13404,7 +13335,6 @@
     <w:p>
       <w:pPr>
         <w:rPr>
-          <w:rFonts w:hint="cs"/>
           <w:rtl/>
         </w:rPr>
       </w:pPr>
@@ -13507,11 +13437,6 @@
       </w:r>
     </w:p>
     <w:p>
-      <w:pPr>
-        <w:rPr>
-          <w:rFonts w:hint="cs"/>
-        </w:rPr>
-      </w:pPr>
       <w:r>
         <w:t>M2</w:t>
       </w:r>
@@ -13651,12 +13576,12 @@
     <w:p>
       <w:pPr>
         <w:rPr>
-          <w:rFonts w:hint="cs"/>
-          <w:rtl/>
-        </w:rPr>
-      </w:pPr>
-      <w:r>
-        <w:rPr>
+          <w:rtl/>
+        </w:rPr>
+      </w:pPr>
+      <w:r>
+        <w:rPr>
+          <w:noProof/>
           <w:rtl/>
         </w:rPr>
         <w:drawing>
@@ -14064,12 +13989,12 @@
     <w:p>
       <w:pPr>
         <w:rPr>
-          <w:rFonts w:hint="cs"/>
-          <w:rtl/>
-        </w:rPr>
-      </w:pPr>
-      <w:r>
-        <w:rPr>
+          <w:rtl/>
+        </w:rPr>
+      </w:pPr>
+      <w:r>
+        <w:rPr>
+          <w:noProof/>
           <w:rtl/>
         </w:rPr>
         <w:drawing>
@@ -14459,12 +14384,12 @@
     <w:p>
       <w:pPr>
         <w:rPr>
-          <w:rFonts w:hint="cs"/>
-          <w:rtl/>
-        </w:rPr>
-      </w:pPr>
-      <w:r>
-        <w:rPr>
+          <w:rtl/>
+        </w:rPr>
+      </w:pPr>
+      <w:r>
+        <w:rPr>
+          <w:noProof/>
           <w:rtl/>
         </w:rPr>
         <w:lastRenderedPageBreak/>
@@ -15824,6 +15749,609 @@
           <w:rtl/>
         </w:rPr>
         <w:t>[להשלים]</w:t>
+      </w:r>
+    </w:p>
+    <w:p>
+      <w:pPr>
+        <w:rPr>
+          <w:rtl/>
+        </w:rPr>
+      </w:pPr>
+    </w:p>
+    <w:p>
+      <w:pPr>
+        <w:rPr>
+          <w:rtl/>
+        </w:rPr>
+      </w:pPr>
+    </w:p>
+    <w:p>
+      <w:pPr>
+        <w:rPr>
+          <w:rtl/>
+        </w:rPr>
+      </w:pPr>
+    </w:p>
+    <w:p>
+      <w:pPr>
+        <w:rPr>
+          <w:rtl/>
+        </w:rPr>
+      </w:pPr>
+    </w:p>
+    <w:p>
+      <w:pPr>
+        <w:rPr>
+          <w:rtl/>
+        </w:rPr>
+      </w:pPr>
+    </w:p>
+    <w:p>
+      <w:pPr>
+        <w:rPr>
+          <w:rtl/>
+        </w:rPr>
+      </w:pPr>
+    </w:p>
+    <w:p>
+      <w:pPr>
+        <w:rPr>
+          <w:rtl/>
+        </w:rPr>
+      </w:pPr>
+    </w:p>
+    <w:p>
+      <w:pPr>
+        <w:rPr>
+          <w:rtl/>
+        </w:rPr>
+      </w:pPr>
+    </w:p>
+    <w:p>
+      <w:pPr>
+        <w:rPr>
+          <w:rtl/>
+        </w:rPr>
+      </w:pPr>
+    </w:p>
+    <w:p>
+      <w:pPr>
+        <w:rPr>
+          <w:rtl/>
+        </w:rPr>
+      </w:pPr>
+    </w:p>
+    <w:p>
+      <w:pPr>
+        <w:rPr>
+          <w:rtl/>
+        </w:rPr>
+      </w:pPr>
+    </w:p>
+    <w:p>
+      <w:pPr>
+        <w:rPr>
+          <w:rtl/>
+        </w:rPr>
+      </w:pPr>
+    </w:p>
+    <w:p>
+      <w:pPr>
+        <w:rPr>
+          <w:rtl/>
+        </w:rPr>
+      </w:pPr>
+    </w:p>
+    <w:p>
+      <w:pPr>
+        <w:rPr>
+          <w:rtl/>
+        </w:rPr>
+      </w:pPr>
+    </w:p>
+    <w:p>
+      <w:pPr>
+        <w:rPr>
+          <w:rtl/>
+        </w:rPr>
+      </w:pPr>
+    </w:p>
+    <w:p>
+      <w:pPr>
+        <w:rPr>
+          <w:rFonts w:hint="cs"/>
+          <w:rtl/>
+        </w:rPr>
+      </w:pPr>
+    </w:p>
+    <w:p>
+      <w:pPr>
+        <w:rPr>
+          <w:rtl/>
+        </w:rPr>
+      </w:pPr>
+    </w:p>
+    <w:p>
+      <w:pPr>
+        <w:rPr>
+          <w:rtl/>
+        </w:rPr>
+      </w:pPr>
+    </w:p>
+    <w:p>
+      <w:pPr>
+        <w:rPr>
+          <w:rtl/>
+        </w:rPr>
+      </w:pPr>
+    </w:p>
+    <w:p>
+      <w:pPr>
+        <w:rPr>
+          <w:rtl/>
+        </w:rPr>
+      </w:pPr>
+    </w:p>
+    <w:p>
+      <w:pPr>
+        <w:rPr>
+          <w:b/>
+          <w:bCs/>
+          <w:sz w:val="36"/>
+          <w:szCs w:val="36"/>
+          <w:u w:val="single"/>
+          <w:rtl/>
+        </w:rPr>
+      </w:pPr>
+      <w:r>
+        <w:rPr>
+          <w:rFonts w:hint="cs"/>
+          <w:b/>
+          <w:bCs/>
+          <w:sz w:val="36"/>
+          <w:szCs w:val="36"/>
+          <w:u w:val="single"/>
+          <w:rtl/>
+        </w:rPr>
+        <w:lastRenderedPageBreak/>
+        <w:t xml:space="preserve">אבן דרך 3 </w:t>
+      </w:r>
+      <w:r>
+        <w:rPr>
+          <w:b/>
+          <w:bCs/>
+          <w:sz w:val="36"/>
+          <w:szCs w:val="36"/>
+          <w:u w:val="single"/>
+          <w:rtl/>
+        </w:rPr>
+        <w:t>–</w:t>
+      </w:r>
+      <w:r>
+        <w:rPr>
+          <w:rFonts w:hint="cs"/>
+          <w:b/>
+          <w:bCs/>
+          <w:sz w:val="36"/>
+          <w:szCs w:val="36"/>
+          <w:u w:val="single"/>
+          <w:rtl/>
+        </w:rPr>
+        <w:t xml:space="preserve"> בנצ'מרק</w:t>
+      </w:r>
+    </w:p>
+    <w:p>
+      <w:pPr>
+        <w:rPr>
+          <w:rtl/>
+        </w:rPr>
+      </w:pPr>
+      <w:r>
+        <w:rPr>
+          <w:rFonts w:hint="cs"/>
+          <w:rtl/>
+        </w:rPr>
+        <w:t xml:space="preserve">באבן דרך זו, אנו בוחנים את המודל של </w:t>
+      </w:r>
+      <w:proofErr w:type="spellStart"/>
+      <w:r>
+        <w:t>TimeFill</w:t>
+      </w:r>
+      <w:proofErr w:type="spellEnd"/>
+      <w:r>
+        <w:rPr>
+          <w:rFonts w:hint="cs"/>
+          <w:rtl/>
+        </w:rPr>
+        <w:t xml:space="preserve"> מול אינטרפולציה לינארית ו </w:t>
+      </w:r>
+      <w:r>
+        <w:t>LOCF</w:t>
+      </w:r>
+      <w:r>
+        <w:rPr>
+          <w:rFonts w:hint="cs"/>
+          <w:rtl/>
+        </w:rPr>
+        <w:t xml:space="preserve">, או </w:t>
+      </w:r>
+      <w:r>
+        <w:t>Last Observation Carried Forward</w:t>
+      </w:r>
+      <w:r>
+        <w:rPr>
+          <w:rFonts w:hint="cs"/>
+          <w:rtl/>
+        </w:rPr>
+        <w:t xml:space="preserve">. אבן דרך זו משתמשת במסלול הנתונים של </w:t>
+      </w:r>
+      <w:r>
+        <w:t>M2</w:t>
+      </w:r>
+      <w:r>
+        <w:rPr>
+          <w:rFonts w:hint="cs"/>
+          <w:rtl/>
+        </w:rPr>
+        <w:t xml:space="preserve"> (חלונות איכות-אוויר של בייג'ינג, פרוטוקולים שמורים ב </w:t>
+      </w:r>
+      <w:r>
+        <w:t>EVAL.md</w:t>
+      </w:r>
+      <w:r>
+        <w:rPr>
+          <w:rFonts w:hint="cs"/>
+          <w:rtl/>
+        </w:rPr>
+        <w:t>, צ'קפוינט מאומן), ומוכיחים את היעילות שלו באופן שמדען נתונים מבצע זאת: אותם פרוטוקולים, אותם מטריקות, זה לצד זה עם בייסליינים בסיסים.</w:t>
+      </w:r>
+    </w:p>
+    <w:p>
+      <w:pPr>
+        <w:rPr>
+          <w:rtl/>
+        </w:rPr>
+      </w:pPr>
+      <w:r>
+        <w:rPr>
+          <w:b/>
+          <w:bCs/>
+          <w:u w:val="single"/>
+        </w:rPr>
+        <w:t>WP0</w:t>
+      </w:r>
+      <w:r>
+        <w:rPr>
+          <w:rFonts w:hint="cs"/>
+          <w:rtl/>
+        </w:rPr>
+        <w:t xml:space="preserve"> </w:t>
+      </w:r>
+      <w:r>
+        <w:rPr>
+          <w:rtl/>
+        </w:rPr>
+        <w:t>–</w:t>
+      </w:r>
+      <w:r>
+        <w:rPr>
+          <w:rFonts w:hint="cs"/>
+          <w:rtl/>
+        </w:rPr>
+        <w:t xml:space="preserve"> חבילה זו נועלת את כללי ההשוואה של </w:t>
+      </w:r>
+      <w:r>
+        <w:t>M3</w:t>
+      </w:r>
+      <w:r>
+        <w:rPr>
+          <w:rFonts w:hint="cs"/>
+          <w:rtl/>
+        </w:rPr>
+        <w:t>. הקובץ היחיד שהיא מוסיפה היא שלד קונפיגורציה. שתי עריכות נוספות מרחיבות את החוזים הקיימים.</w:t>
+      </w:r>
+    </w:p>
+    <w:p>
+      <w:pPr>
+        <w:rPr>
+          <w:rtl/>
+        </w:rPr>
+      </w:pPr>
+      <w:r>
+        <w:t>M3</w:t>
+      </w:r>
+      <w:r>
+        <w:rPr>
+          <w:rFonts w:hint="cs"/>
+          <w:rtl/>
+        </w:rPr>
+        <w:t xml:space="preserve"> היא שכבת הראיות: אותם פערים ממושכים, שמנוקדים באותו האופן, עבור </w:t>
+      </w:r>
+      <w:proofErr w:type="spellStart"/>
+      <w:r>
+        <w:t>TimeFill</w:t>
+      </w:r>
+      <w:proofErr w:type="spellEnd"/>
+      <w:r>
+        <w:t>, LOCF, linear</w:t>
+      </w:r>
+      <w:r>
+        <w:rPr>
+          <w:rFonts w:hint="cs"/>
+          <w:rtl/>
+        </w:rPr>
+        <w:t>. אם החלוקה (</w:t>
+      </w:r>
+      <w:r>
+        <w:t>split</w:t>
+      </w:r>
+      <w:r>
+        <w:rPr>
+          <w:rFonts w:hint="cs"/>
+          <w:rtl/>
+        </w:rPr>
+        <w:t>), קצבים (</w:t>
+      </w:r>
+      <w:r>
+        <w:t>rates</w:t>
+      </w:r>
+      <w:r>
+        <w:rPr>
+          <w:rFonts w:hint="cs"/>
+          <w:rtl/>
+        </w:rPr>
+        <w:t xml:space="preserve">), </w:t>
+      </w:r>
+      <w:proofErr w:type="spellStart"/>
+      <w:r>
+        <w:rPr>
+          <w:rFonts w:hint="cs"/>
+          <w:rtl/>
+        </w:rPr>
+        <w:t>סידים</w:t>
+      </w:r>
+      <w:proofErr w:type="spellEnd"/>
+      <w:r>
+        <w:rPr>
+          <w:rFonts w:hint="cs"/>
+          <w:rtl/>
+        </w:rPr>
+        <w:t>, או תאי מטריקות נבחרות במריץ מאוחר יותר, שני הרצות יכולות</w:t>
+      </w:r>
+      <w:r>
+        <w:rPr>
+          <w:rFonts w:hint="cs"/>
+          <w:rtl/>
+        </w:rPr>
+        <w:t xml:space="preserve"> להיבדל זה מזה מסיבות שאינן קשורות למודל. </w:t>
+      </w:r>
+      <w:r>
+        <w:t>WP0</w:t>
+      </w:r>
+      <w:r>
+        <w:rPr>
+          <w:rFonts w:hint="cs"/>
+          <w:rtl/>
+        </w:rPr>
+        <w:t xml:space="preserve"> מקפיא את כל זה לפני שאיזשהו קוד בייסליין קיים.</w:t>
+      </w:r>
+    </w:p>
+    <w:p>
+      <w:pPr>
+        <w:rPr>
+          <w:rtl/>
+        </w:rPr>
+      </w:pPr>
+      <w:r>
+        <w:rPr>
+          <w:b/>
+          <w:bCs/>
+          <w:u w:val="single"/>
+        </w:rPr>
+        <w:t>WP1</w:t>
+      </w:r>
+      <w:r>
+        <w:rPr>
+          <w:rFonts w:hint="cs"/>
+          <w:rtl/>
+        </w:rPr>
+        <w:t xml:space="preserve"> </w:t>
+      </w:r>
+      <w:r>
+        <w:rPr>
+          <w:rtl/>
+        </w:rPr>
+        <w:t>–</w:t>
+      </w:r>
+      <w:r>
+        <w:rPr>
+          <w:rFonts w:hint="cs"/>
+          <w:rtl/>
+        </w:rPr>
+        <w:t xml:space="preserve"> חבילה זו מוסיפה תיקיית </w:t>
+      </w:r>
+      <w:proofErr w:type="spellStart"/>
+      <w:r>
+        <w:t>src</w:t>
+      </w:r>
+      <w:proofErr w:type="spellEnd"/>
+      <w:r>
+        <w:t>/baselines</w:t>
+      </w:r>
+      <w:r>
+        <w:rPr>
+          <w:rFonts w:hint="cs"/>
+          <w:rtl/>
+        </w:rPr>
+        <w:t xml:space="preserve"> חדשה.</w:t>
+      </w:r>
+    </w:p>
+    <w:p>
+      <w:pPr>
+        <w:rPr>
+          <w:rFonts w:hint="cs"/>
+          <w:rtl/>
+        </w:rPr>
+      </w:pPr>
+      <w:r>
+        <w:rPr>
+          <w:rtl/>
+        </w:rPr>
+        <w:drawing>
+          <wp:inline distT="0" distB="0" distL="0" distR="0" wp14:anchorId="5CC4496C" wp14:editId="63CE714C">
+            <wp:extent cx="5731510" cy="2521585"/>
+            <wp:effectExtent l="0" t="0" r="2540" b="0"/>
+            <wp:docPr id="900742735" name="Picture 1"/>
+            <wp:cNvGraphicFramePr>
+              <a:graphicFrameLocks xmlns:a="http://schemas.openxmlformats.org/drawingml/2006/main" noChangeAspect="1"/>
+            </wp:cNvGraphicFramePr>
+            <a:graphic xmlns:a="http://schemas.openxmlformats.org/drawingml/2006/main">
+              <a:graphicData uri="http://schemas.openxmlformats.org/drawingml/2006/picture">
+                <pic:pic xmlns:pic="http://schemas.openxmlformats.org/drawingml/2006/picture">
+                  <pic:nvPicPr>
+                    <pic:cNvPr id="900742735" name=""/>
+                    <pic:cNvPicPr/>
+                  </pic:nvPicPr>
+                  <pic:blipFill>
+                    <a:blip r:embed="rId19"/>
+                    <a:stretch>
+                      <a:fillRect/>
+                    </a:stretch>
+                  </pic:blipFill>
+                  <pic:spPr>
+                    <a:xfrm>
+                      <a:off x="0" y="0"/>
+                      <a:ext cx="5731510" cy="2521585"/>
+                    </a:xfrm>
+                    <a:prstGeom prst="rect">
+                      <a:avLst/>
+                    </a:prstGeom>
+                  </pic:spPr>
+                </pic:pic>
+              </a:graphicData>
+            </a:graphic>
+          </wp:inline>
+        </w:drawing>
+      </w:r>
+    </w:p>
+    <w:p>
+      <w:pPr>
+        <w:rPr>
+          <w:rtl/>
+        </w:rPr>
+      </w:pPr>
+      <w:r>
+        <w:rPr>
+          <w:rFonts w:hint="cs"/>
+          <w:u w:val="single"/>
+          <w:rtl/>
+        </w:rPr>
+        <w:t>חוזה</w:t>
+      </w:r>
+      <w:r>
+        <w:rPr>
+          <w:rFonts w:hint="cs"/>
+          <w:rtl/>
+        </w:rPr>
+        <w:t xml:space="preserve">: ערכים הם </w:t>
+      </w:r>
+      <w:r>
+        <w:t>values</w:t>
+      </w:r>
+      <w:r>
+        <w:rPr>
+          <w:rFonts w:hint="cs"/>
+          <w:rtl/>
+        </w:rPr>
+        <w:t xml:space="preserve"> + </w:t>
+      </w:r>
+      <w:proofErr w:type="spellStart"/>
+      <w:r>
+        <w:rPr>
+          <w:rFonts w:hint="cs"/>
+          <w:rtl/>
+        </w:rPr>
+        <w:t>מאסק</w:t>
+      </w:r>
+      <w:proofErr w:type="spellEnd"/>
+      <w:r>
+        <w:rPr>
+          <w:rFonts w:hint="cs"/>
+          <w:rtl/>
+        </w:rPr>
+        <w:t xml:space="preserve"> הערכה </w:t>
+      </w:r>
+      <w:r>
+        <w:t>m</w:t>
+      </w:r>
+      <w:r>
+        <w:rPr>
+          <w:rFonts w:hint="cs"/>
+          <w:rtl/>
+        </w:rPr>
+        <w:t xml:space="preserve"> (1 אם נצפה, 0 אם חסר), </w:t>
+      </w:r>
+      <w:r>
+        <w:t>x</w:t>
+      </w:r>
+      <w:r>
+        <w:rPr>
+          <w:rFonts w:hint="cs"/>
+          <w:rtl/>
+        </w:rPr>
+        <w:t xml:space="preserve"> חסר הופך להיות 0.0. התוצאה הוא טנזור ממולא מאותה הצורה. מקרי קצה (חורים מובילים, אין שכנים שניתן להשתמש בהם, פיצ'ר שבו הכל חסר) משתמשים בווקטור </w:t>
+      </w:r>
+      <w:r>
+        <w:t xml:space="preserve">caller-supplied </w:t>
+      </w:r>
+      <w:proofErr w:type="spellStart"/>
+      <w:r>
+        <w:t>feature_means</w:t>
+      </w:r>
+      <w:proofErr w:type="spellEnd"/>
+      <w:r>
+        <w:rPr>
+          <w:rFonts w:hint="cs"/>
+          <w:rtl/>
+        </w:rPr>
+        <w:t xml:space="preserve">, שנועד להיות </w:t>
+      </w:r>
+      <w:proofErr w:type="spellStart"/>
+      <w:r>
+        <w:t>FeatureScaler.mean</w:t>
+      </w:r>
+      <w:proofErr w:type="spellEnd"/>
+      <w:r>
+        <w:rPr>
+          <w:rFonts w:hint="cs"/>
+          <w:rtl/>
+        </w:rPr>
+        <w:t xml:space="preserve"> מאוחר יותר ב </w:t>
+      </w:r>
+      <w:r>
+        <w:t>WP2</w:t>
+      </w:r>
+      <w:r>
+        <w:rPr>
+          <w:rFonts w:hint="cs"/>
+          <w:rtl/>
+        </w:rPr>
+        <w:t>...</w:t>
+      </w:r>
+    </w:p>
+    <w:p>
+      <w:pPr>
+        <w:rPr>
+          <w:rFonts w:hint="cs"/>
+          <w:rtl/>
+        </w:rPr>
+      </w:pPr>
+      <w:r>
+        <w:rPr>
+          <w:rFonts w:hint="cs"/>
+          <w:rtl/>
+        </w:rPr>
+        <w:t>[להשלים יותר מאוחר]</w:t>
       </w:r>
     </w:p>
     <w:sectPr>

</xml_diff>